<commit_message>
feat: add transfer receipt functionality with share and print options
- Implemented a new receipt page for transfer transactions, accessible by both sender and receiver.
- Added ReceiptActions component for sharing and printing receipts.
- Updated TransferForm to provide a link to the receipt after a successful transfer.
- Enhanced transaction rows to include a link for viewing the receipt.
- Updated styles for print compatibility and improved user experience.
- Modified student authentication to include receipt access.
- Adjusted various documentation and guides to reflect changes in the transfer process and receipt handling.
</commit_message>
<xml_diff>
--- a/docs/ColePay-Quinto-Alumnos.docx
+++ b/docs/ColePay-Quinto-Alumnos.docx
@@ -61,7 +61,7 @@
           <w:sz w:val="52"/>
           <w:szCs w:val="52"/>
         </w:rPr>
-        <w:t xml:space="preserve">El banco en 10 pantallas</w:t>
+        <w:t xml:space="preserve">El banco en 11 pantallas</w:t>
       </w:r>
     </w:p>
     <w:p>
@@ -190,7 +190,7 @@
                 <w:sz w:val="21"/>
                 <w:szCs w:val="21"/>
               </w:rPr>
-              <w:t xml:space="preserve">Los clientes son los de tercero</w:t>
+              <w:t xml:space="preserve">Sus clientes son los que dan de alta</w:t>
             </w:r>
           </w:p>
           <w:p>
@@ -204,7 +204,7 @@
                 <w:sz w:val="19"/>
                 <w:szCs w:val="19"/>
               </w:rPr>
-              <w:t xml:space="preserve">Les piden tarjetas, préstamos, cheques y efectivo.</w:t>
+              <w:t xml:space="preserve">Sólo atienden a los alumnos de tercero adheridos a su banco.</w:t>
             </w:r>
           </w:p>
         </w:tc>
@@ -272,7 +272,7 @@
           <w:szCs w:val="18"/>
           <w:shd w:fill="5B3FD1" w:color="auto" w:val="clear"/>
         </w:rPr>
-        <w:t xml:space="preserve"> 1 de 10 </w:t>
+        <w:t xml:space="preserve"> 1 de 11 </w:t>
       </w:r>
       <w:r>
         <w:rPr>
@@ -572,7 +572,7 @@
           <w:szCs w:val="18"/>
           <w:shd w:fill="5B3FD1" w:color="auto" w:val="clear"/>
         </w:rPr>
-        <w:t xml:space="preserve"> 2 de 10 </w:t>
+        <w:t xml:space="preserve"> 2 de 11 </w:t>
       </w:r>
       <w:r>
         <w:rPr>
@@ -628,7 +628,7 @@
           <w:sz w:val="21"/>
           <w:szCs w:val="21"/>
         </w:rPr>
-        <w:t xml:space="preserve">Ocho secciones. El globito amarillo avisa cuántas cosas hay esperando.</w:t>
+        <w:t xml:space="preserve">Nueve secciones. El globito amarillo avisa cuántas cosas hay esperando.</w:t>
       </w:r>
     </w:p>
     <w:p>
@@ -772,7 +772,7 @@
                 <w:sz w:val="21"/>
                 <w:szCs w:val="21"/>
               </w:rPr>
-              <w:t xml:space="preserve">Solicitudes</w:t>
+              <w:t xml:space="preserve">Clientes</w:t>
             </w:r>
           </w:p>
         </w:tc>
@@ -797,7 +797,7 @@
                 <w:sz w:val="21"/>
                 <w:szCs w:val="21"/>
               </w:rPr>
-              <w:t xml:space="preserve">Los que piden tarjeta. Ustedes deciden si se la dan y con qué límite.</w:t>
+              <w:t xml:space="preserve">Los alumnos adheridos a su banco: acá se los da de alta y de baja.</w:t>
             </w:r>
           </w:p>
         </w:tc>
@@ -826,7 +826,7 @@
                 <w:sz w:val="21"/>
                 <w:szCs w:val="21"/>
               </w:rPr>
-              <w:t xml:space="preserve">Tarjetas</w:t>
+              <w:t xml:space="preserve">Solicitudes</w:t>
             </w:r>
           </w:p>
         </w:tc>
@@ -851,7 +851,7 @@
                 <w:sz w:val="21"/>
                 <w:szCs w:val="21"/>
               </w:rPr>
-              <w:t xml:space="preserve">Las que ya emitieron: cambiar el límite, bloquear, cerrar el resumen.</w:t>
+              <w:t xml:space="preserve">Los clientes que piden tarjeta. Ustedes deciden si se la dan y con qué límite.</w:t>
             </w:r>
           </w:p>
         </w:tc>
@@ -880,7 +880,7 @@
                 <w:sz w:val="21"/>
                 <w:szCs w:val="21"/>
               </w:rPr>
-              <w:t xml:space="preserve">Préstamos</w:t>
+              <w:t xml:space="preserve">Tarjetas</w:t>
             </w:r>
           </w:p>
         </w:tc>
@@ -905,7 +905,7 @@
                 <w:sz w:val="21"/>
                 <w:szCs w:val="21"/>
               </w:rPr>
-              <w:t xml:space="preserve">Los que piden plata en cuotas.</w:t>
+              <w:t xml:space="preserve">Las que ya emitieron: cambiar el límite, bloquear, cerrar el resumen.</w:t>
             </w:r>
           </w:p>
         </w:tc>
@@ -934,7 +934,7 @@
                 <w:sz w:val="21"/>
                 <w:szCs w:val="21"/>
               </w:rPr>
-              <w:t xml:space="preserve">Cheques</w:t>
+              <w:t xml:space="preserve">Préstamos</w:t>
             </w:r>
           </w:p>
         </w:tc>
@@ -959,7 +959,7 @@
                 <w:sz w:val="21"/>
                 <w:szCs w:val="21"/>
               </w:rPr>
-              <w:t xml:space="preserve">Cobrar o rechazar los cheques que traen al banco.</w:t>
+              <w:t xml:space="preserve">Los clientes que piden plata en cuotas.</w:t>
             </w:r>
           </w:p>
         </w:tc>
@@ -988,7 +988,7 @@
                 <w:sz w:val="21"/>
                 <w:szCs w:val="21"/>
               </w:rPr>
-              <w:t xml:space="preserve">Ventanilla</w:t>
+              <w:t xml:space="preserve">Cheques</w:t>
             </w:r>
           </w:p>
         </w:tc>
@@ -1013,7 +1013,61 @@
                 <w:sz w:val="21"/>
                 <w:szCs w:val="21"/>
               </w:rPr>
-              <w:t xml:space="preserve">Recibir y entregar billetes.</w:t>
+              <w:t xml:space="preserve">Cobrar o rechazar los cheques de sus clientes.</w:t>
+            </w:r>
+          </w:p>
+        </w:tc>
+      </w:tr>
+      <w:tr>
+        <w:trPr>
+          <w:cantSplit/>
+        </w:trPr>
+        <w:tc>
+          <w:tcPr>
+            <w:tcW w:type="dxa" w:w="2200"/>
+            <w:tcMar>
+              <w:top w:type="dxa" w:w="90"/>
+              <w:left w:type="dxa" w:w="140"/>
+              <w:bottom w:type="dxa" w:w="90"/>
+              <w:right w:type="dxa" w:w="100"/>
+            </w:tcMar>
+          </w:tcPr>
+          <w:p>
+            <w:r>
+              <w:rPr>
+                <w:rFonts w:ascii="Calibri" w:cs="Calibri" w:eastAsia="Calibri" w:hAnsi="Calibri"/>
+                <w:b/>
+                <w:bCs/>
+                <w:color w:val="111827"/>
+                <w:sz w:val="21"/>
+                <w:szCs w:val="21"/>
+              </w:rPr>
+              <w:t xml:space="preserve">Ventanilla</w:t>
+            </w:r>
+          </w:p>
+        </w:tc>
+        <w:tc>
+          <w:tcPr>
+            <w:tcW w:type="dxa" w:w="6826"/>
+            <w:tcMar>
+              <w:top w:type="dxa" w:w="90"/>
+              <w:left w:type="dxa" w:w="100"/>
+              <w:bottom w:type="dxa" w:w="90"/>
+              <w:right w:type="dxa" w:w="140"/>
+            </w:tcMar>
+          </w:tcPr>
+          <w:p>
+            <w:pPr>
+              <w:spacing w:line="264"/>
+            </w:pPr>
+            <w:r>
+              <w:rPr>
+                <w:rFonts w:ascii="Calibri" w:cs="Calibri" w:eastAsia="Calibri" w:hAnsi="Calibri"/>
+                <w:color w:val="111827"/>
+                <w:sz w:val="21"/>
+                <w:szCs w:val="21"/>
+              </w:rPr>
+              <w:t xml:space="preserve">Recibir y entregar billetes a sus clientes.</w:t>
             </w:r>
           </w:p>
         </w:tc>
@@ -1142,7 +1196,7 @@
           <w:szCs w:val="18"/>
           <w:shd w:fill="5B3FD1" w:color="auto" w:val="clear"/>
         </w:rPr>
-        <w:t xml:space="preserve"> 3 de 10 </w:t>
+        <w:t xml:space="preserve"> 3 de 11 </w:t>
       </w:r>
       <w:r>
         <w:rPr>
@@ -1162,7 +1216,7 @@
           <w:sz w:val="30"/>
           <w:szCs w:val="30"/>
         </w:rPr>
-        <w:t xml:space="preserve">Los números del mostrador</w:t>
+        <w:t xml:space="preserve">Hacer cliente a un alumno</w:t>
       </w:r>
       <w:r>
         <w:rPr>
@@ -1183,7 +1237,7 @@
           <w:szCs w:val="17"/>
           <w:shd w:fill="EFEBFB" w:color="auto" w:val="clear"/>
         </w:rPr>
-        <w:t xml:space="preserve"> → Mostrador </w:t>
+        <w:t xml:space="preserve"> → Clientes </w:t>
       </w:r>
     </w:p>
     <w:p>
@@ -1198,7 +1252,7 @@
           <w:sz w:val="21"/>
           <w:szCs w:val="21"/>
         </w:rPr>
-        <w:t xml:space="preserve">Los cinco números que hay que mirar apenas entran.</w:t>
+        <w:t xml:space="preserve">Un alumno de tercero sólo opera con los bancos a los que lo adhirieron. Se presenta, hacen el trámite en persona y lo dan de alta acá.</w:t>
       </w:r>
     </w:p>
     <w:p>
@@ -1210,7 +1264,7 @@
       <w:r>
         <w:drawing>
           <wp:inline distT="0" distB="0" distL="0" distR="0">
-            <wp:extent cx="5715000" cy="2476500"/>
+            <wp:extent cx="5715000" cy="6410325"/>
             <wp:effectExtent t="0" r="0" b="0" l="0"/>
             <wp:docPr id="1" name="" descr="" title=""/>
             <wp:cNvGraphicFramePr>
@@ -1235,7 +1289,7 @@
                   <pic:spPr bwMode="auto">
                     <a:xfrm>
                       <a:off x="0" y="0"/>
-                      <a:ext cx="5715000" cy="2476500"/>
+                      <a:ext cx="5715000" cy="6410325"/>
                     </a:xfrm>
                     <a:prstGeom prst="rect">
                       <a:avLst/>
@@ -1302,7 +1356,7 @@
                 <w:sz w:val="20"/>
                 <w:szCs w:val="20"/>
               </w:rPr>
-              <w:t xml:space="preserve">La plata que tienen</w:t>
+              <w:t xml:space="preserve">El alumno que se presentó</w:t>
             </w:r>
           </w:p>
           <w:p>
@@ -1328,7 +1382,7 @@
                 <w:sz w:val="20"/>
                 <w:szCs w:val="20"/>
               </w:rPr>
-              <w:t xml:space="preserve">Lo que está afuera</w:t>
+              <w:t xml:space="preserve">Una nota, si hace falta</w:t>
             </w:r>
           </w:p>
           <w:p>
@@ -1354,7 +1408,7 @@
                 <w:sz w:val="20"/>
                 <w:szCs w:val="20"/>
               </w:rPr>
-              <w:t xml:space="preserve">Pedidos sin contestar</w:t>
+              <w:t xml:space="preserve">Queda adherido al banco</w:t>
             </w:r>
           </w:p>
         </w:tc>
@@ -1392,7 +1446,7 @@
                 <w:sz w:val="20"/>
                 <w:szCs w:val="20"/>
               </w:rPr>
-              <w:t xml:space="preserve">Tarjetas que emitieron</w:t>
+              <w:t xml:space="preserve">Todos sus clientes</w:t>
             </w:r>
           </w:p>
           <w:p>
@@ -1418,7 +1472,91 @@
                 <w:sz w:val="20"/>
                 <w:szCs w:val="20"/>
               </w:rPr>
-              <w:t xml:space="preserve">Clientes que no pagaron</w:t>
+              <w:t xml:space="preserve">Su primer banco es el principal</w:t>
+            </w:r>
+          </w:p>
+          <w:p>
+            <w:pPr>
+              <w:spacing w:after="80" w:line="264"/>
+              <w:ind w:left="300" w:hanging="300"/>
+            </w:pPr>
+            <w:r>
+              <w:rPr>
+                <w:rFonts w:ascii="Calibri" w:cs="Calibri" w:eastAsia="Calibri" w:hAnsi="Calibri"/>
+                <w:b/>
+                <w:bCs/>
+                <w:color w:val="D6104A"/>
+                <w:sz w:val="24"/>
+                <w:szCs w:val="24"/>
+              </w:rPr>
+              <w:t xml:space="preserve">⑥ </w:t>
+            </w:r>
+            <w:r>
+              <w:rPr>
+                <w:rFonts w:ascii="Calibri" w:cs="Calibri" w:eastAsia="Calibri" w:hAnsi="Calibri"/>
+                <w:color w:val="111827"/>
+                <w:sz w:val="20"/>
+                <w:szCs w:val="20"/>
+              </w:rPr>
+              <w:t xml:space="preserve">Darlo de baja</w:t>
+            </w:r>
+          </w:p>
+        </w:tc>
+      </w:tr>
+    </w:tbl>
+    <w:tbl>
+      <w:tblPr>
+        <w:tblW w:type="dxa" w:w="9026"/>
+        <w:tblBorders>
+          <w:top w:val="none" w:color="FFFFFF" w:sz="0"/>
+          <w:left w:val="single" w:color="5B3FD1" w:sz="18"/>
+          <w:bottom w:val="none" w:color="FFFFFF" w:sz="0"/>
+          <w:right w:val="none" w:color="FFFFFF" w:sz="0"/>
+          <w:insideH w:val="none" w:color="FFFFFF" w:sz="0"/>
+          <w:insideV w:val="none" w:color="FFFFFF" w:sz="0"/>
+        </w:tblBorders>
+      </w:tblPr>
+      <w:tblGrid>
+        <w:gridCol w:w="9026"/>
+      </w:tblGrid>
+      <w:tr>
+        <w:trPr>
+          <w:cantSplit/>
+        </w:trPr>
+        <w:tc>
+          <w:tcPr>
+            <w:tcW w:type="dxa" w:w="9026"/>
+            <w:shd w:fill="EFEBFB" w:color="auto" w:val="clear"/>
+            <w:tcMar>
+              <w:top w:type="dxa" w:w="120"/>
+              <w:left w:type="dxa" w:w="160"/>
+              <w:bottom w:type="dxa" w:w="120"/>
+              <w:right w:type="dxa" w:w="160"/>
+            </w:tcMar>
+          </w:tcPr>
+          <w:p>
+            <w:pPr>
+              <w:spacing w:line="276"/>
+            </w:pPr>
+            <w:r>
+              <w:rPr>
+                <w:rFonts w:ascii="Calibri" w:cs="Calibri" w:eastAsia="Calibri" w:hAnsi="Calibri"/>
+                <w:b/>
+                <w:bCs/>
+                <w:color w:val="5B3FD1"/>
+                <w:sz w:val="21"/>
+                <w:szCs w:val="21"/>
+              </w:rPr>
+              <w:t xml:space="preserve">Sin alta no hay nada: </w:t>
+            </w:r>
+            <w:r>
+              <w:rPr>
+                <w:rFonts w:ascii="Calibri" w:cs="Calibri" w:eastAsia="Calibri" w:hAnsi="Calibri"/>
+                <w:color w:val="111827"/>
+                <w:sz w:val="21"/>
+                <w:szCs w:val="21"/>
+              </w:rPr>
+              <w:t xml:space="preserve">no puede pedirles tarjeta, préstamo ni plazo fijo, ni operar por la ventanilla. Los papeles del trámite son en persona, fuera de la plataforma: acá sólo se registra el alta.</w:t>
             </w:r>
           </w:p>
         </w:tc>
@@ -1467,26 +1605,21 @@
                 <w:sz w:val="21"/>
                 <w:szCs w:val="21"/>
               </w:rPr>
-              <w:t xml:space="preserve">Si la caja llega a cero, el banco se frena. </w:t>
-            </w:r>
-            <w:r>
-              <w:rPr>
-                <w:rFonts w:ascii="Calibri" w:cs="Calibri" w:eastAsia="Calibri" w:hAnsi="Calibri"/>
-                <w:color w:val="111827"/>
-                <w:sz w:val="21"/>
-                <w:szCs w:val="21"/>
-              </w:rPr>
-              <w:t xml:space="preserve">Las compras con tarjeta de sus clientes se rechazan, no pueden desembolsar préstamos y no les alcanza para pagar una extracción por ventanilla.</w:t>
+              <w:t xml:space="preserve">Un cliente puede estar en varios bancos. </w:t>
+            </w:r>
+            <w:r>
+              <w:rPr>
+                <w:rFonts w:ascii="Calibri" w:cs="Calibri" w:eastAsia="Calibri" w:hAnsi="Calibri"/>
+                <w:color w:val="111827"/>
+                <w:sz w:val="21"/>
+                <w:szCs w:val="21"/>
+              </w:rPr>
+              <w:t xml:space="preserve">El primero al que se adhirió es su banco principal. No pueden darlo de baja mientras tenga con ustedes una tarjeta, un préstamo, un plazo fijo o una solicitud abierta.</w:t>
             </w:r>
           </w:p>
         </w:tc>
       </w:tr>
     </w:tbl>
-    <w:p>
-      <w:r>
-        <w:br w:type="page"/>
-      </w:r>
-    </w:p>
     <w:p>
       <w:pPr>
         <w:keepNext/>
@@ -1502,7 +1635,7 @@
           <w:szCs w:val="18"/>
           <w:shd w:fill="5B3FD1" w:color="auto" w:val="clear"/>
         </w:rPr>
-        <w:t xml:space="preserve"> 4 de 10 </w:t>
+        <w:t xml:space="preserve"> 4 de 11 </w:t>
       </w:r>
       <w:r>
         <w:rPr>
@@ -1522,7 +1655,7 @@
           <w:sz w:val="30"/>
           <w:szCs w:val="30"/>
         </w:rPr>
-        <w:t xml:space="preserve">Dar una tarjeta</w:t>
+        <w:t xml:space="preserve">Los números del mostrador</w:t>
       </w:r>
       <w:r>
         <w:rPr>
@@ -1543,7 +1676,7 @@
           <w:szCs w:val="17"/>
           <w:shd w:fill="EFEBFB" w:color="auto" w:val="clear"/>
         </w:rPr>
-        <w:t xml:space="preserve"> → Solicitudes </w:t>
+        <w:t xml:space="preserve"> → Mostrador </w:t>
       </w:r>
     </w:p>
     <w:p>
@@ -1558,7 +1691,7 @@
           <w:sz w:val="21"/>
           <w:szCs w:val="21"/>
         </w:rPr>
-        <w:t xml:space="preserve">Primero miran quién pide y con qué respaldo. No están obligados a dar lo que piden.</w:t>
+        <w:t xml:space="preserve">Los cinco números que hay que mirar apenas entran.</w:t>
       </w:r>
     </w:p>
     <w:p>
@@ -1570,7 +1703,7 @@
       <w:r>
         <w:drawing>
           <wp:inline distT="0" distB="0" distL="0" distR="0">
-            <wp:extent cx="5715000" cy="2419350"/>
+            <wp:extent cx="5715000" cy="2476500"/>
             <wp:effectExtent t="0" r="0" b="0" l="0"/>
             <wp:docPr id="1" name="" descr="" title=""/>
             <wp:cNvGraphicFramePr>
@@ -1595,7 +1728,7 @@
                   <pic:spPr bwMode="auto">
                     <a:xfrm>
                       <a:off x="0" y="0"/>
-                      <a:ext cx="5715000" cy="2419350"/>
+                      <a:ext cx="5715000" cy="2476500"/>
                     </a:xfrm>
                     <a:prstGeom prst="rect">
                       <a:avLst/>
@@ -1662,7 +1795,7 @@
                 <w:sz w:val="20"/>
                 <w:szCs w:val="20"/>
               </w:rPr>
-              <w:t xml:space="preserve">Quién la pide y de qué curso</w:t>
+              <w:t xml:space="preserve">La plata que tienen</w:t>
             </w:r>
           </w:p>
           <w:p>
@@ -1688,7 +1821,7 @@
                 <w:sz w:val="20"/>
                 <w:szCs w:val="20"/>
               </w:rPr>
-              <w:t xml:space="preserve">Cuánto pide</w:t>
+              <w:t xml:space="preserve">Lo que está afuera</w:t>
             </w:r>
           </w:p>
           <w:p>
@@ -1714,7 +1847,7 @@
                 <w:sz w:val="20"/>
                 <w:szCs w:val="20"/>
               </w:rPr>
-              <w:t xml:space="preserve">Con qué plata cuenta</w:t>
+              <w:t xml:space="preserve">Pedidos sin contestar</w:t>
             </w:r>
           </w:p>
         </w:tc>
@@ -1752,7 +1885,7 @@
                 <w:sz w:val="20"/>
                 <w:szCs w:val="20"/>
               </w:rPr>
-              <w:t xml:space="preserve">Para qué la quiere</w:t>
+              <w:t xml:space="preserve">Tarjetas que emitieron</w:t>
             </w:r>
           </w:p>
           <w:p>
@@ -1778,12 +1911,134 @@
                 <w:sz w:val="20"/>
                 <w:szCs w:val="20"/>
               </w:rPr>
-              <w:t xml:space="preserve">Aprobar o rechazar</w:t>
+              <w:t xml:space="preserve">Clientes que no pagaron</w:t>
             </w:r>
           </w:p>
         </w:tc>
       </w:tr>
     </w:tbl>
+    <w:tbl>
+      <w:tblPr>
+        <w:tblW w:type="dxa" w:w="9026"/>
+        <w:tblBorders>
+          <w:top w:val="none" w:color="FFFFFF" w:sz="0"/>
+          <w:left w:val="single" w:color="D6104A" w:sz="18"/>
+          <w:bottom w:val="none" w:color="FFFFFF" w:sz="0"/>
+          <w:right w:val="none" w:color="FFFFFF" w:sz="0"/>
+          <w:insideH w:val="none" w:color="FFFFFF" w:sz="0"/>
+          <w:insideV w:val="none" w:color="FFFFFF" w:sz="0"/>
+        </w:tblBorders>
+      </w:tblPr>
+      <w:tblGrid>
+        <w:gridCol w:w="9026"/>
+      </w:tblGrid>
+      <w:tr>
+        <w:trPr>
+          <w:cantSplit/>
+        </w:trPr>
+        <w:tc>
+          <w:tcPr>
+            <w:tcW w:type="dxa" w:w="9026"/>
+            <w:shd w:fill="FDEEF1" w:color="auto" w:val="clear"/>
+            <w:tcMar>
+              <w:top w:type="dxa" w:w="120"/>
+              <w:left w:type="dxa" w:w="160"/>
+              <w:bottom w:type="dxa" w:w="120"/>
+              <w:right w:type="dxa" w:w="160"/>
+            </w:tcMar>
+          </w:tcPr>
+          <w:p>
+            <w:pPr>
+              <w:spacing w:line="276"/>
+            </w:pPr>
+            <w:r>
+              <w:rPr>
+                <w:rFonts w:ascii="Calibri" w:cs="Calibri" w:eastAsia="Calibri" w:hAnsi="Calibri"/>
+                <w:b/>
+                <w:bCs/>
+                <w:color w:val="D6104A"/>
+                <w:sz w:val="21"/>
+                <w:szCs w:val="21"/>
+              </w:rPr>
+              <w:t xml:space="preserve">Si la caja llega a cero, el banco se frena. </w:t>
+            </w:r>
+            <w:r>
+              <w:rPr>
+                <w:rFonts w:ascii="Calibri" w:cs="Calibri" w:eastAsia="Calibri" w:hAnsi="Calibri"/>
+                <w:color w:val="111827"/>
+                <w:sz w:val="21"/>
+                <w:szCs w:val="21"/>
+              </w:rPr>
+              <w:t xml:space="preserve">Las compras con tarjeta de sus clientes se rechazan, no pueden desembolsar préstamos y no les alcanza para pagar una extracción por ventanilla.</w:t>
+            </w:r>
+          </w:p>
+        </w:tc>
+      </w:tr>
+    </w:tbl>
+    <w:p>
+      <w:r>
+        <w:br w:type="page"/>
+      </w:r>
+    </w:p>
+    <w:p>
+      <w:pPr>
+        <w:keepNext/>
+        <w:spacing w:after="90" w:before="300"/>
+      </w:pPr>
+      <w:r>
+        <w:rPr>
+          <w:rFonts w:ascii="Calibri" w:cs="Calibri" w:eastAsia="Calibri" w:hAnsi="Calibri"/>
+          <w:b/>
+          <w:bCs/>
+          <w:color w:val="FFFFFF"/>
+          <w:sz w:val="18"/>
+          <w:szCs w:val="18"/>
+          <w:shd w:fill="5B3FD1" w:color="auto" w:val="clear"/>
+        </w:rPr>
+        <w:t xml:space="preserve"> 5 de 11 </w:t>
+      </w:r>
+      <w:r>
+        <w:rPr>
+          <w:rFonts w:ascii="Calibri" w:cs="Calibri" w:eastAsia="Calibri" w:hAnsi="Calibri"/>
+          <w:color w:val="111827"/>
+          <w:sz w:val="21"/>
+          <w:szCs w:val="21"/>
+        </w:rPr>
+        <w:t xml:space="preserve">  </w:t>
+      </w:r>
+      <w:r>
+        <w:rPr>
+          <w:rFonts w:ascii="Calibri" w:cs="Calibri" w:eastAsia="Calibri" w:hAnsi="Calibri"/>
+          <w:b/>
+          <w:bCs/>
+          <w:color w:val="111827"/>
+          <w:sz w:val="30"/>
+          <w:szCs w:val="30"/>
+        </w:rPr>
+        <w:t xml:space="preserve">Dar una tarjeta</w:t>
+      </w:r>
+      <w:r>
+        <w:rPr>
+          <w:rFonts w:ascii="Calibri" w:cs="Calibri" w:eastAsia="Calibri" w:hAnsi="Calibri"/>
+          <w:color w:val="111827"/>
+          <w:sz w:val="21"/>
+          <w:szCs w:val="21"/>
+        </w:rPr>
+        <w:t xml:space="preserve">   </w:t>
+      </w:r>
+      <w:r>
+        <w:rPr>
+          <w:rFonts w:ascii="Calibri" w:cs="Calibri" w:eastAsia="Calibri" w:hAnsi="Calibri"/>
+          <w:b/>
+          <w:bCs/>
+          <w:color w:val="5B3FD1"/>
+          <w:sz w:val="17"/>
+          <w:szCs w:val="17"/>
+          <w:shd w:fill="EFEBFB" w:color="auto" w:val="clear"/>
+        </w:rPr>
+        <w:t xml:space="preserve"> → Solicitudes </w:t>
+      </w:r>
+    </w:p>
     <w:p>
       <w:pPr>
         <w:keepNext/>
@@ -1796,7 +2051,7 @@
           <w:sz w:val="21"/>
           <w:szCs w:val="21"/>
         </w:rPr>
-        <w:t xml:space="preserve">Si aprueban, cargan los datos del plástico que ya tienen en el aula.</w:t>
+        <w:t xml:space="preserve">Sólo les llegan pedidos de sus clientes. Miran quién pide y con qué respaldo: no están obligados a dar lo que piden.</w:t>
       </w:r>
     </w:p>
     <w:p>
@@ -1808,7 +2063,7 @@
       <w:r>
         <w:drawing>
           <wp:inline distT="0" distB="0" distL="0" distR="0">
-            <wp:extent cx="5715000" cy="6781800"/>
+            <wp:extent cx="5715000" cy="2419350"/>
             <wp:effectExtent t="0" r="0" b="0" l="0"/>
             <wp:docPr id="1" name="" descr="" title=""/>
             <wp:cNvGraphicFramePr>
@@ -1833,7 +2088,7 @@
                   <pic:spPr bwMode="auto">
                     <a:xfrm>
                       <a:off x="0" y="0"/>
-                      <a:ext cx="5715000" cy="6781800"/>
+                      <a:ext cx="5715000" cy="2419350"/>
                     </a:xfrm>
                     <a:prstGeom prst="rect">
                       <a:avLst/>
@@ -1900,7 +2155,7 @@
                 <w:sz w:val="20"/>
                 <w:szCs w:val="20"/>
               </w:rPr>
-              <w:t xml:space="preserve">El límite que le dan ustedes</w:t>
+              <w:t xml:space="preserve">Quién la pide y de qué curso</w:t>
             </w:r>
           </w:p>
           <w:p>
@@ -1926,7 +2181,7 @@
                 <w:sz w:val="20"/>
                 <w:szCs w:val="20"/>
               </w:rPr>
-              <w:t xml:space="preserve">Marca del plástico</w:t>
+              <w:t xml:space="preserve">Cuánto pide</w:t>
             </w:r>
           </w:p>
           <w:p>
@@ -1952,7 +2207,7 @@
                 <w:sz w:val="20"/>
                 <w:szCs w:val="20"/>
               </w:rPr>
-              <w:t xml:space="preserve">Copiar los datos del plástico</w:t>
+              <w:t xml:space="preserve">Con qué plata cuenta</w:t>
             </w:r>
           </w:p>
         </w:tc>
@@ -1990,7 +2245,7 @@
                 <w:sz w:val="20"/>
                 <w:szCs w:val="20"/>
               </w:rPr>
-              <w:t xml:space="preserve">Los 16 números de la tarjeta</w:t>
+              <w:t xml:space="preserve">Para qué la quiere</w:t>
             </w:r>
           </w:p>
           <w:p>
@@ -2016,91 +2271,7 @@
                 <w:sz w:val="20"/>
                 <w:szCs w:val="20"/>
               </w:rPr>
-              <w:t xml:space="preserve">Nombre impreso y vencimiento</w:t>
-            </w:r>
-          </w:p>
-          <w:p>
-            <w:pPr>
-              <w:spacing w:after="80" w:line="264"/>
-              <w:ind w:left="300" w:hanging="300"/>
-            </w:pPr>
-            <w:r>
-              <w:rPr>
-                <w:rFonts w:ascii="Calibri" w:cs="Calibri" w:eastAsia="Calibri" w:hAnsi="Calibri"/>
-                <w:b/>
-                <w:bCs/>
-                <w:color w:val="D6104A"/>
-                <w:sz w:val="24"/>
-                <w:szCs w:val="24"/>
-              </w:rPr>
-              <w:t xml:space="preserve">⑥ </w:t>
-            </w:r>
-            <w:r>
-              <w:rPr>
-                <w:rFonts w:ascii="Calibri" w:cs="Calibri" w:eastAsia="Calibri" w:hAnsi="Calibri"/>
-                <w:color w:val="111827"/>
-                <w:sz w:val="20"/>
-                <w:szCs w:val="20"/>
-              </w:rPr>
-              <w:t xml:space="preserve">Queda emitida</w:t>
-            </w:r>
-          </w:p>
-        </w:tc>
-      </w:tr>
-    </w:tbl>
-    <w:tbl>
-      <w:tblPr>
-        <w:tblW w:type="dxa" w:w="9026"/>
-        <w:tblBorders>
-          <w:top w:val="none" w:color="FFFFFF" w:sz="0"/>
-          <w:left w:val="single" w:color="5B3FD1" w:sz="18"/>
-          <w:bottom w:val="none" w:color="FFFFFF" w:sz="0"/>
-          <w:right w:val="none" w:color="FFFFFF" w:sz="0"/>
-          <w:insideH w:val="none" w:color="FFFFFF" w:sz="0"/>
-          <w:insideV w:val="none" w:color="FFFFFF" w:sz="0"/>
-        </w:tblBorders>
-      </w:tblPr>
-      <w:tblGrid>
-        <w:gridCol w:w="9026"/>
-      </w:tblGrid>
-      <w:tr>
-        <w:trPr>
-          <w:cantSplit/>
-        </w:trPr>
-        <w:tc>
-          <w:tcPr>
-            <w:tcW w:type="dxa" w:w="9026"/>
-            <w:shd w:fill="EFEBFB" w:color="auto" w:val="clear"/>
-            <w:tcMar>
-              <w:top w:type="dxa" w:w="120"/>
-              <w:left w:type="dxa" w:w="160"/>
-              <w:bottom w:type="dxa" w:w="120"/>
-              <w:right w:type="dxa" w:w="160"/>
-            </w:tcMar>
-          </w:tcPr>
-          <w:p>
-            <w:pPr>
-              <w:spacing w:line="276"/>
-            </w:pPr>
-            <w:r>
-              <w:rPr>
-                <w:rFonts w:ascii="Calibri" w:cs="Calibri" w:eastAsia="Calibri" w:hAnsi="Calibri"/>
-                <w:b/>
-                <w:bCs/>
-                <w:color w:val="5B3FD1"/>
-                <w:sz w:val="21"/>
-                <w:szCs w:val="21"/>
-              </w:rPr>
-              <w:t xml:space="preserve">Los datos tienen que coincidir con la tarjeta de cartón. </w:t>
-            </w:r>
-            <w:r>
-              <w:rPr>
-                <w:rFonts w:ascii="Calibri" w:cs="Calibri" w:eastAsia="Calibri" w:hAnsi="Calibri"/>
-                <w:color w:val="111827"/>
-                <w:sz w:val="21"/>
-                <w:szCs w:val="21"/>
-              </w:rPr>
-              <w:t xml:space="preserve">El número se valida como uno real: si está mal tipeado, no deja emitirla.</w:t>
+              <w:t xml:space="preserve">Aprobar o rechazar</w:t>
             </w:r>
           </w:p>
         </w:tc>
@@ -2109,20 +2280,8 @@
     <w:p>
       <w:pPr>
         <w:keepNext/>
-        <w:spacing w:after="90" w:before="300"/>
+        <w:spacing w:after="100" w:line="276"/>
       </w:pPr>
-      <w:r>
-        <w:rPr>
-          <w:rFonts w:ascii="Calibri" w:cs="Calibri" w:eastAsia="Calibri" w:hAnsi="Calibri"/>
-          <w:b/>
-          <w:bCs/>
-          <w:color w:val="FFFFFF"/>
-          <w:sz w:val="18"/>
-          <w:szCs w:val="18"/>
-          <w:shd w:fill="5B3FD1" w:color="auto" w:val="clear"/>
-        </w:rPr>
-        <w:t xml:space="preserve"> 5 de 10 </w:t>
-      </w:r>
       <w:r>
         <w:rPr>
           <w:rFonts w:ascii="Calibri" w:cs="Calibri" w:eastAsia="Calibri" w:hAnsi="Calibri"/>
@@ -2130,54 +2289,7 @@
           <w:sz w:val="21"/>
           <w:szCs w:val="21"/>
         </w:rPr>
-        <w:t xml:space="preserve">  </w:t>
-      </w:r>
-      <w:r>
-        <w:rPr>
-          <w:rFonts w:ascii="Calibri" w:cs="Calibri" w:eastAsia="Calibri" w:hAnsi="Calibri"/>
-          <w:b/>
-          <w:bCs/>
-          <w:color w:val="111827"/>
-          <w:sz w:val="30"/>
-          <w:szCs w:val="30"/>
-        </w:rPr>
-        <w:t xml:space="preserve">Cobrar la tarjeta</w:t>
-      </w:r>
-      <w:r>
-        <w:rPr>
-          <w:rFonts w:ascii="Calibri" w:cs="Calibri" w:eastAsia="Calibri" w:hAnsi="Calibri"/>
-          <w:color w:val="111827"/>
-          <w:sz w:val="21"/>
-          <w:szCs w:val="21"/>
-        </w:rPr>
-        <w:t xml:space="preserve">   </w:t>
-      </w:r>
-      <w:r>
-        <w:rPr>
-          <w:rFonts w:ascii="Calibri" w:cs="Calibri" w:eastAsia="Calibri" w:hAnsi="Calibri"/>
-          <w:b/>
-          <w:bCs/>
-          <w:color w:val="5B3FD1"/>
-          <w:sz w:val="17"/>
-          <w:szCs w:val="17"/>
-          <w:shd w:fill="EFEBFB" w:color="auto" w:val="clear"/>
-        </w:rPr>
-        <w:t xml:space="preserve"> → Tarjetas </w:t>
-      </w:r>
-    </w:p>
-    <w:p>
-      <w:pPr>
-        <w:keepNext/>
-        <w:spacing w:after="100" w:line="276"/>
-      </w:pPr>
-      <w:r>
-        <w:rPr>
-          <w:rFonts w:ascii="Calibri" w:cs="Calibri" w:eastAsia="Calibri" w:hAnsi="Calibri"/>
-          <w:color w:val="111827"/>
-          <w:sz w:val="21"/>
-          <w:szCs w:val="21"/>
-        </w:rPr>
-        <w:t xml:space="preserve">Cada consumo lo adelanta el banco. El resumen es la forma de recuperarlo.</w:t>
+        <w:t xml:space="preserve">Si aprueban, cargan los datos del plástico que ya tienen en el aula.</w:t>
       </w:r>
     </w:p>
     <w:p>
@@ -2189,7 +2301,7 @@
       <w:r>
         <w:drawing>
           <wp:inline distT="0" distB="0" distL="0" distR="0">
-            <wp:extent cx="5715000" cy="3476625"/>
+            <wp:extent cx="5715000" cy="6781800"/>
             <wp:effectExtent t="0" r="0" b="0" l="0"/>
             <wp:docPr id="1" name="" descr="" title=""/>
             <wp:cNvGraphicFramePr>
@@ -2214,7 +2326,7 @@
                   <pic:spPr bwMode="auto">
                     <a:xfrm>
                       <a:off x="0" y="0"/>
-                      <a:ext cx="5715000" cy="3476625"/>
+                      <a:ext cx="5715000" cy="6781800"/>
                     </a:xfrm>
                     <a:prstGeom prst="rect">
                       <a:avLst/>
@@ -2281,7 +2393,7 @@
                 <w:sz w:val="20"/>
                 <w:szCs w:val="20"/>
               </w:rPr>
-              <w:t xml:space="preserve">El cliente</w:t>
+              <w:t xml:space="preserve">El límite que le dan ustedes</w:t>
             </w:r>
           </w:p>
           <w:p>
@@ -2307,7 +2419,7 @@
                 <w:sz w:val="20"/>
                 <w:szCs w:val="20"/>
               </w:rPr>
-              <w:t xml:space="preserve">Cuánto debe hoy</w:t>
+              <w:t xml:space="preserve">Marca del plástico</w:t>
             </w:r>
           </w:p>
           <w:p>
@@ -2333,7 +2445,7 @@
                 <w:sz w:val="20"/>
                 <w:szCs w:val="20"/>
               </w:rPr>
-              <w:t xml:space="preserve">Subir o bajar el límite</w:t>
+              <w:t xml:space="preserve">Copiar los datos del plástico</w:t>
             </w:r>
           </w:p>
         </w:tc>
@@ -2371,7 +2483,7 @@
                 <w:sz w:val="20"/>
                 <w:szCs w:val="20"/>
               </w:rPr>
-              <w:t xml:space="preserve">Bloquear la tarjeta</w:t>
+              <w:t xml:space="preserve">Los 16 números de la tarjeta</w:t>
             </w:r>
           </w:p>
           <w:p>
@@ -2397,7 +2509,33 @@
                 <w:sz w:val="20"/>
                 <w:szCs w:val="20"/>
               </w:rPr>
-              <w:t xml:space="preserve">Emitir el resumen</w:t>
+              <w:t xml:space="preserve">Nombre impreso y vencimiento</w:t>
+            </w:r>
+          </w:p>
+          <w:p>
+            <w:pPr>
+              <w:spacing w:after="80" w:line="264"/>
+              <w:ind w:left="300" w:hanging="300"/>
+            </w:pPr>
+            <w:r>
+              <w:rPr>
+                <w:rFonts w:ascii="Calibri" w:cs="Calibri" w:eastAsia="Calibri" w:hAnsi="Calibri"/>
+                <w:b/>
+                <w:bCs/>
+                <w:color w:val="D6104A"/>
+                <w:sz w:val="24"/>
+                <w:szCs w:val="24"/>
+              </w:rPr>
+              <w:t xml:space="preserve">⑥ </w:t>
+            </w:r>
+            <w:r>
+              <w:rPr>
+                <w:rFonts w:ascii="Calibri" w:cs="Calibri" w:eastAsia="Calibri" w:hAnsi="Calibri"/>
+                <w:color w:val="111827"/>
+                <w:sz w:val="20"/>
+                <w:szCs w:val="20"/>
+              </w:rPr>
+              <w:t xml:space="preserve">Queda emitida</w:t>
             </w:r>
           </w:p>
         </w:tc>
@@ -2446,26 +2584,21 @@
                 <w:sz w:val="21"/>
                 <w:szCs w:val="21"/>
               </w:rPr>
-              <w:t xml:space="preserve">Cerrar el período emite el resumen </w:t>
-            </w:r>
-            <w:r>
-              <w:rPr>
-                <w:rFonts w:ascii="Calibri" w:cs="Calibri" w:eastAsia="Calibri" w:hAnsi="Calibri"/>
-                <w:color w:val="111827"/>
-                <w:sz w:val="21"/>
-                <w:szCs w:val="21"/>
-              </w:rPr>
-              <w:t xml:space="preserve">y le llega al cliente con su fecha de vencimiento. Si no paga, entra en mora y el banco le cobra interés.</w:t>
+              <w:t xml:space="preserve">Los datos tienen que coincidir con la tarjeta de cartón. </w:t>
+            </w:r>
+            <w:r>
+              <w:rPr>
+                <w:rFonts w:ascii="Calibri" w:cs="Calibri" w:eastAsia="Calibri" w:hAnsi="Calibri"/>
+                <w:color w:val="111827"/>
+                <w:sz w:val="21"/>
+                <w:szCs w:val="21"/>
+              </w:rPr>
+              <w:t xml:space="preserve">El número se valida como uno real: si está mal tipeado, no deja emitirla.</w:t>
             </w:r>
           </w:p>
         </w:tc>
       </w:tr>
     </w:tbl>
-    <w:p>
-      <w:r>
-        <w:br w:type="page"/>
-      </w:r>
-    </w:p>
     <w:p>
       <w:pPr>
         <w:keepNext/>
@@ -2481,7 +2614,7 @@
           <w:szCs w:val="18"/>
           <w:shd w:fill="5B3FD1" w:color="auto" w:val="clear"/>
         </w:rPr>
-        <w:t xml:space="preserve"> 6 de 10 </w:t>
+        <w:t xml:space="preserve"> 6 de 11 </w:t>
       </w:r>
       <w:r>
         <w:rPr>
@@ -2501,7 +2634,7 @@
           <w:sz w:val="30"/>
           <w:szCs w:val="30"/>
         </w:rPr>
-        <w:t xml:space="preserve">Prestar plata</w:t>
+        <w:t xml:space="preserve">Cobrar la tarjeta</w:t>
       </w:r>
       <w:r>
         <w:rPr>
@@ -2522,7 +2655,7 @@
           <w:szCs w:val="17"/>
           <w:shd w:fill="EFEBFB" w:color="auto" w:val="clear"/>
         </w:rPr>
-        <w:t xml:space="preserve"> → Préstamos </w:t>
+        <w:t xml:space="preserve"> → Tarjetas </w:t>
       </w:r>
     </w:p>
     <w:p>
@@ -2537,7 +2670,7 @@
           <w:sz w:val="21"/>
           <w:szCs w:val="21"/>
         </w:rPr>
-        <w:t xml:space="preserve">Ustedes eligen cuánto, a qué interés y en cuántas cuotas. La cuenta se ve antes de firmar.</w:t>
+        <w:t xml:space="preserve">Cada consumo lo adelanta el banco. El resumen es la forma de recuperarlo.</w:t>
       </w:r>
     </w:p>
     <w:p>
@@ -2549,7 +2682,7 @@
       <w:r>
         <w:drawing>
           <wp:inline distT="0" distB="0" distL="0" distR="0">
-            <wp:extent cx="5715000" cy="3876675"/>
+            <wp:extent cx="5715000" cy="3476625"/>
             <wp:effectExtent t="0" r="0" b="0" l="0"/>
             <wp:docPr id="1" name="" descr="" title=""/>
             <wp:cNvGraphicFramePr>
@@ -2574,7 +2707,7 @@
                   <pic:spPr bwMode="auto">
                     <a:xfrm>
                       <a:off x="0" y="0"/>
-                      <a:ext cx="5715000" cy="3876675"/>
+                      <a:ext cx="5715000" cy="3476625"/>
                     </a:xfrm>
                     <a:prstGeom prst="rect">
                       <a:avLst/>
@@ -2641,7 +2774,7 @@
                 <w:sz w:val="20"/>
                 <w:szCs w:val="20"/>
               </w:rPr>
-              <w:t xml:space="preserve">Capital que sale de la caja</w:t>
+              <w:t xml:space="preserve">El cliente</w:t>
             </w:r>
           </w:p>
           <w:p>
@@ -2667,7 +2800,7 @@
                 <w:sz w:val="20"/>
                 <w:szCs w:val="20"/>
               </w:rPr>
-              <w:t xml:space="preserve">Interés por mes</w:t>
+              <w:t xml:space="preserve">Cuánto debe hoy</w:t>
             </w:r>
           </w:p>
           <w:p>
@@ -2693,7 +2826,7 @@
                 <w:sz w:val="20"/>
                 <w:szCs w:val="20"/>
               </w:rPr>
-              <w:t xml:space="preserve">En cuántas cuotas</w:t>
+              <w:t xml:space="preserve">Subir o bajar el límite</w:t>
             </w:r>
           </w:p>
         </w:tc>
@@ -2731,7 +2864,7 @@
                 <w:sz w:val="20"/>
                 <w:szCs w:val="20"/>
               </w:rPr>
-              <w:t xml:space="preserve">La cuenta hecha: la ganancia del banco</w:t>
+              <w:t xml:space="preserve">Bloquear la tarjeta</w:t>
             </w:r>
           </w:p>
           <w:p>
@@ -2757,7 +2890,7 @@
                 <w:sz w:val="20"/>
                 <w:szCs w:val="20"/>
               </w:rPr>
-              <w:t xml:space="preserve">Le sale la plata</w:t>
+              <w:t xml:space="preserve">Emitir el resumen</w:t>
             </w:r>
           </w:p>
         </w:tc>
@@ -2768,7 +2901,7 @@
         <w:tblW w:type="dxa" w:w="9026"/>
         <w:tblBorders>
           <w:top w:val="none" w:color="FFFFFF" w:sz="0"/>
-          <w:left w:val="single" w:color="D6104A" w:sz="18"/>
+          <w:left w:val="single" w:color="5B3FD1" w:sz="18"/>
           <w:bottom w:val="none" w:color="FFFFFF" w:sz="0"/>
           <w:right w:val="none" w:color="FFFFFF" w:sz="0"/>
           <w:insideH w:val="none" w:color="FFFFFF" w:sz="0"/>
@@ -2785,7 +2918,7 @@
         <w:tc>
           <w:tcPr>
             <w:tcW w:type="dxa" w:w="9026"/>
-            <w:shd w:fill="FDEEF1" w:color="auto" w:val="clear"/>
+            <w:shd w:fill="EFEBFB" w:color="auto" w:val="clear"/>
             <w:tcMar>
               <w:top w:type="dxa" w:w="120"/>
               <w:left w:type="dxa" w:w="160"/>
@@ -2802,25 +2935,30 @@
                 <w:rFonts w:ascii="Calibri" w:cs="Calibri" w:eastAsia="Calibri" w:hAnsi="Calibri"/>
                 <w:b/>
                 <w:bCs/>
-                <w:color w:val="D6104A"/>
-                <w:sz w:val="21"/>
-                <w:szCs w:val="21"/>
-              </w:rPr>
-              <w:t xml:space="preserve">El capital sale de la caja en el momento. </w:t>
-            </w:r>
-            <w:r>
-              <w:rPr>
-                <w:rFonts w:ascii="Calibri" w:cs="Calibri" w:eastAsia="Calibri" w:hAnsi="Calibri"/>
-                <w:color w:val="111827"/>
-                <w:sz w:val="21"/>
-                <w:szCs w:val="21"/>
-              </w:rPr>
-              <w:t xml:space="preserve">Vuelve de a poco, en cuotas. Presten mirando lo que les queda para atender al resto.</w:t>
+                <w:color w:val="5B3FD1"/>
+                <w:sz w:val="21"/>
+                <w:szCs w:val="21"/>
+              </w:rPr>
+              <w:t xml:space="preserve">Cerrar el período emite el resumen </w:t>
+            </w:r>
+            <w:r>
+              <w:rPr>
+                <w:rFonts w:ascii="Calibri" w:cs="Calibri" w:eastAsia="Calibri" w:hAnsi="Calibri"/>
+                <w:color w:val="111827"/>
+                <w:sz w:val="21"/>
+                <w:szCs w:val="21"/>
+              </w:rPr>
+              <w:t xml:space="preserve">y le llega al cliente con su fecha de vencimiento. Si no paga, entra en mora y el banco le cobra interés.</w:t>
             </w:r>
           </w:p>
         </w:tc>
       </w:tr>
     </w:tbl>
+    <w:p>
+      <w:r>
+        <w:br w:type="page"/>
+      </w:r>
+    </w:p>
     <w:p>
       <w:pPr>
         <w:keepNext/>
@@ -2836,7 +2974,7 @@
           <w:szCs w:val="18"/>
           <w:shd w:fill="5B3FD1" w:color="auto" w:val="clear"/>
         </w:rPr>
-        <w:t xml:space="preserve"> 7 de 10 </w:t>
+        <w:t xml:space="preserve"> 7 de 11 </w:t>
       </w:r>
       <w:r>
         <w:rPr>
@@ -2856,7 +2994,7 @@
           <w:sz w:val="30"/>
           <w:szCs w:val="30"/>
         </w:rPr>
-        <w:t xml:space="preserve">Cobrar un cheque</w:t>
+        <w:t xml:space="preserve">Prestar plata</w:t>
       </w:r>
       <w:r>
         <w:rPr>
@@ -2877,7 +3015,7 @@
           <w:szCs w:val="17"/>
           <w:shd w:fill="EFEBFB" w:color="auto" w:val="clear"/>
         </w:rPr>
-        <w:t xml:space="preserve"> → Cheques </w:t>
+        <w:t xml:space="preserve"> → Préstamos </w:t>
       </w:r>
     </w:p>
     <w:p>
@@ -2892,7 +3030,7 @@
           <w:sz w:val="21"/>
           <w:szCs w:val="21"/>
         </w:rPr>
-        <w:t xml:space="preserve">Viene el beneficiario con el papel. Antes de pagar, miran si el que lo firmó tiene la plata.</w:t>
+        <w:t xml:space="preserve">Ustedes eligen cuánto, a qué interés y en cuántas cuotas. La cuenta se ve antes de firmar.</w:t>
       </w:r>
     </w:p>
     <w:p>
@@ -2904,7 +3042,7 @@
       <w:r>
         <w:drawing>
           <wp:inline distT="0" distB="0" distL="0" distR="0">
-            <wp:extent cx="5715000" cy="1905000"/>
+            <wp:extent cx="5715000" cy="3876675"/>
             <wp:effectExtent t="0" r="0" b="0" l="0"/>
             <wp:docPr id="1" name="" descr="" title=""/>
             <wp:cNvGraphicFramePr>
@@ -2929,7 +3067,7 @@
                   <pic:spPr bwMode="auto">
                     <a:xfrm>
                       <a:off x="0" y="0"/>
-                      <a:ext cx="5715000" cy="1905000"/>
+                      <a:ext cx="5715000" cy="3876675"/>
                     </a:xfrm>
                     <a:prstGeom prst="rect">
                       <a:avLst/>
@@ -2996,7 +3134,7 @@
                 <w:sz w:val="20"/>
                 <w:szCs w:val="20"/>
               </w:rPr>
-              <w:t xml:space="preserve">Importe y número del papel</w:t>
+              <w:t xml:space="preserve">Capital que sale de la caja</w:t>
             </w:r>
           </w:p>
           <w:p>
@@ -3022,7 +3160,7 @@
                 <w:sz w:val="20"/>
                 <w:szCs w:val="20"/>
               </w:rPr>
-              <w:t xml:space="preserve">Quién lo firmó y para quién es</w:t>
+              <w:t xml:space="preserve">Interés por mes</w:t>
             </w:r>
           </w:p>
           <w:p>
@@ -3048,7 +3186,7 @@
                 <w:sz w:val="20"/>
                 <w:szCs w:val="20"/>
               </w:rPr>
-              <w:t xml:space="preserve">Si el que firmó tiene la plata</w:t>
+              <w:t xml:space="preserve">En cuántas cuotas</w:t>
             </w:r>
           </w:p>
         </w:tc>
@@ -3086,7 +3224,7 @@
                 <w:sz w:val="20"/>
                 <w:szCs w:val="20"/>
               </w:rPr>
-              <w:t xml:space="preserve">Pagarlo</w:t>
+              <w:t xml:space="preserve">La cuenta hecha: la ganancia del banco</w:t>
             </w:r>
           </w:p>
           <w:p>
@@ -3112,7 +3250,7 @@
                 <w:sz w:val="20"/>
                 <w:szCs w:val="20"/>
               </w:rPr>
-              <w:t xml:space="preserve">No pagarlo</w:t>
+              <w:t xml:space="preserve">Le sale la plata</w:t>
             </w:r>
           </w:p>
         </w:tc>
@@ -3161,16 +3299,16 @@
                 <w:sz w:val="21"/>
                 <w:szCs w:val="21"/>
               </w:rPr>
-              <w:t xml:space="preserve">Sin fondos, el cheque rebota. </w:t>
-            </w:r>
-            <w:r>
-              <w:rPr>
-                <w:rFonts w:ascii="Calibri" w:cs="Calibri" w:eastAsia="Calibri" w:hAnsi="Calibri"/>
-                <w:color w:val="111827"/>
-                <w:sz w:val="21"/>
-                <w:szCs w:val="21"/>
-              </w:rPr>
-              <w:t xml:space="preserve">Queda registrado en el historial del que lo firmó y todos los bancos lo ven. Un cheque diferido no se paga antes de su fecha.</w:t>
+              <w:t xml:space="preserve">El capital sale de la caja en el momento. </w:t>
+            </w:r>
+            <w:r>
+              <w:rPr>
+                <w:rFonts w:ascii="Calibri" w:cs="Calibri" w:eastAsia="Calibri" w:hAnsi="Calibri"/>
+                <w:color w:val="111827"/>
+                <w:sz w:val="21"/>
+                <w:szCs w:val="21"/>
+              </w:rPr>
+              <w:t xml:space="preserve">Vuelve de a poco, en cuotas. Presten mirando lo que les queda para atender al resto.</w:t>
             </w:r>
           </w:p>
         </w:tc>
@@ -3179,8 +3317,20 @@
     <w:p>
       <w:pPr>
         <w:keepNext/>
-        <w:spacing w:after="100" w:line="276"/>
+        <w:spacing w:after="90" w:before="300"/>
       </w:pPr>
+      <w:r>
+        <w:rPr>
+          <w:rFonts w:ascii="Calibri" w:cs="Calibri" w:eastAsia="Calibri" w:hAnsi="Calibri"/>
+          <w:b/>
+          <w:bCs/>
+          <w:color w:val="FFFFFF"/>
+          <w:sz w:val="18"/>
+          <w:szCs w:val="18"/>
+          <w:shd w:fill="5B3FD1" w:color="auto" w:val="clear"/>
+        </w:rPr>
+        <w:t xml:space="preserve"> 8 de 11 </w:t>
+      </w:r>
       <w:r>
         <w:rPr>
           <w:rFonts w:ascii="Calibri" w:cs="Calibri" w:eastAsia="Calibri" w:hAnsi="Calibri"/>
@@ -3188,7 +3338,54 @@
           <w:sz w:val="21"/>
           <w:szCs w:val="21"/>
         </w:rPr>
-        <w:t xml:space="preserve">Si el cheque no está cargado en el sistema, lo cargan ustedes con el papel a la vista.</w:t>
+        <w:t xml:space="preserve">  </w:t>
+      </w:r>
+      <w:r>
+        <w:rPr>
+          <w:rFonts w:ascii="Calibri" w:cs="Calibri" w:eastAsia="Calibri" w:hAnsi="Calibri"/>
+          <w:b/>
+          <w:bCs/>
+          <w:color w:val="111827"/>
+          <w:sz w:val="30"/>
+          <w:szCs w:val="30"/>
+        </w:rPr>
+        <w:t xml:space="preserve">Cobrar un cheque</w:t>
+      </w:r>
+      <w:r>
+        <w:rPr>
+          <w:rFonts w:ascii="Calibri" w:cs="Calibri" w:eastAsia="Calibri" w:hAnsi="Calibri"/>
+          <w:color w:val="111827"/>
+          <w:sz w:val="21"/>
+          <w:szCs w:val="21"/>
+        </w:rPr>
+        <w:t xml:space="preserve">   </w:t>
+      </w:r>
+      <w:r>
+        <w:rPr>
+          <w:rFonts w:ascii="Calibri" w:cs="Calibri" w:eastAsia="Calibri" w:hAnsi="Calibri"/>
+          <w:b/>
+          <w:bCs/>
+          <w:color w:val="5B3FD1"/>
+          <w:sz w:val="17"/>
+          <w:szCs w:val="17"/>
+          <w:shd w:fill="EFEBFB" w:color="auto" w:val="clear"/>
+        </w:rPr>
+        <w:t xml:space="preserve"> → Cheques </w:t>
+      </w:r>
+    </w:p>
+    <w:p>
+      <w:pPr>
+        <w:keepNext/>
+        <w:spacing w:after="100" w:line="276"/>
+      </w:pPr>
+      <w:r>
+        <w:rPr>
+          <w:rFonts w:ascii="Calibri" w:cs="Calibri" w:eastAsia="Calibri" w:hAnsi="Calibri"/>
+          <w:color w:val="111827"/>
+          <w:sz w:val="21"/>
+          <w:szCs w:val="21"/>
+        </w:rPr>
+        <w:t xml:space="preserve">Viene el beneficiario con el papel. Sólo ven los cheques de sus clientes: el que cobra tiene que estar adherido a su banco. Antes de pagar, miran si el que lo firmó tiene la plata.</w:t>
       </w:r>
     </w:p>
     <w:p>
@@ -3200,7 +3397,7 @@
       <w:r>
         <w:drawing>
           <wp:inline distT="0" distB="0" distL="0" distR="0">
-            <wp:extent cx="5715000" cy="5334000"/>
+            <wp:extent cx="5715000" cy="1905000"/>
             <wp:effectExtent t="0" r="0" b="0" l="0"/>
             <wp:docPr id="1" name="" descr="" title=""/>
             <wp:cNvGraphicFramePr>
@@ -3225,7 +3422,7 @@
                   <pic:spPr bwMode="auto">
                     <a:xfrm>
                       <a:off x="0" y="0"/>
-                      <a:ext cx="5715000" cy="5334000"/>
+                      <a:ext cx="5715000" cy="1905000"/>
                     </a:xfrm>
                     <a:prstGeom prst="rect">
                       <a:avLst/>
@@ -3292,7 +3489,7 @@
                 <w:sz w:val="20"/>
                 <w:szCs w:val="20"/>
               </w:rPr>
-              <w:t xml:space="preserve">Lo que se queda el banco</w:t>
+              <w:t xml:space="preserve">Importe y número del papel</w:t>
             </w:r>
           </w:p>
           <w:p>
@@ -3318,7 +3515,7 @@
                 <w:sz w:val="20"/>
                 <w:szCs w:val="20"/>
               </w:rPr>
-              <w:t xml:space="preserve">Número del papel</w:t>
+              <w:t xml:space="preserve">Quién lo firmó y para quién es</w:t>
             </w:r>
           </w:p>
           <w:p>
@@ -3344,7 +3541,7 @@
                 <w:sz w:val="20"/>
                 <w:szCs w:val="20"/>
               </w:rPr>
-              <w:t xml:space="preserve">Importe</w:t>
+              <w:t xml:space="preserve">Si el que firmó tiene la plata</w:t>
             </w:r>
           </w:p>
         </w:tc>
@@ -3382,7 +3579,7 @@
                 <w:sz w:val="20"/>
                 <w:szCs w:val="20"/>
               </w:rPr>
-              <w:t xml:space="preserve">Quién lo firmó</w:t>
+              <w:t xml:space="preserve">Pagarlo</w:t>
             </w:r>
           </w:p>
           <w:p>
@@ -3408,33 +3605,7 @@
                 <w:sz w:val="20"/>
                 <w:szCs w:val="20"/>
               </w:rPr>
-              <w:t xml:space="preserve">A la orden de quién</w:t>
-            </w:r>
-          </w:p>
-          <w:p>
-            <w:pPr>
-              <w:spacing w:after="80" w:line="264"/>
-              <w:ind w:left="300" w:hanging="300"/>
-            </w:pPr>
-            <w:r>
-              <w:rPr>
-                <w:rFonts w:ascii="Calibri" w:cs="Calibri" w:eastAsia="Calibri" w:hAnsi="Calibri"/>
-                <w:b/>
-                <w:bCs/>
-                <w:color w:val="D6104A"/>
-                <w:sz w:val="24"/>
-                <w:szCs w:val="24"/>
-              </w:rPr>
-              <w:t xml:space="preserve">⑥ </w:t>
-            </w:r>
-            <w:r>
-              <w:rPr>
-                <w:rFonts w:ascii="Calibri" w:cs="Calibri" w:eastAsia="Calibri" w:hAnsi="Calibri"/>
-                <w:color w:val="111827"/>
-                <w:sz w:val="20"/>
-                <w:szCs w:val="20"/>
-              </w:rPr>
-              <w:t xml:space="preserve">Desde cuándo se puede cobrar</w:t>
+              <w:t xml:space="preserve">No pagarlo</w:t>
             </w:r>
           </w:p>
         </w:tc>
@@ -3445,7 +3616,7 @@
         <w:tblW w:type="dxa" w:w="9026"/>
         <w:tblBorders>
           <w:top w:val="none" w:color="FFFFFF" w:sz="0"/>
-          <w:left w:val="single" w:color="5B3FD1" w:sz="18"/>
+          <w:left w:val="single" w:color="D6104A" w:sz="18"/>
           <w:bottom w:val="none" w:color="FFFFFF" w:sz="0"/>
           <w:right w:val="none" w:color="FFFFFF" w:sz="0"/>
           <w:insideH w:val="none" w:color="FFFFFF" w:sz="0"/>
@@ -3462,7 +3633,7 @@
         <w:tc>
           <w:tcPr>
             <w:tcW w:type="dxa" w:w="9026"/>
-            <w:shd w:fill="EFEBFB" w:color="auto" w:val="clear"/>
+            <w:shd w:fill="FDEEF1" w:color="auto" w:val="clear"/>
             <w:tcMar>
               <w:top w:type="dxa" w:w="120"/>
               <w:left w:type="dxa" w:w="160"/>
@@ -3479,89 +3650,25 @@
                 <w:rFonts w:ascii="Calibri" w:cs="Calibri" w:eastAsia="Calibri" w:hAnsi="Calibri"/>
                 <w:b/>
                 <w:bCs/>
-                <w:color w:val="5B3FD1"/>
-                <w:sz w:val="21"/>
-                <w:szCs w:val="21"/>
-              </w:rPr>
-              <w:t xml:space="preserve">Nunca lo carga el que lo viene a cobrar. </w:t>
-            </w:r>
-            <w:r>
-              <w:rPr>
-                <w:rFonts w:ascii="Calibri" w:cs="Calibri" w:eastAsia="Calibri" w:hAnsi="Calibri"/>
-                <w:color w:val="111827"/>
-                <w:sz w:val="21"/>
-                <w:szCs w:val="21"/>
-              </w:rPr>
-              <w:t xml:space="preserve">Lo carga el que lo firmó, o ustedes con el papel delante.</w:t>
+                <w:color w:val="D6104A"/>
+                <w:sz w:val="21"/>
+                <w:szCs w:val="21"/>
+              </w:rPr>
+              <w:t xml:space="preserve">Sin fondos, el cheque rebota. </w:t>
+            </w:r>
+            <w:r>
+              <w:rPr>
+                <w:rFonts w:ascii="Calibri" w:cs="Calibri" w:eastAsia="Calibri" w:hAnsi="Calibri"/>
+                <w:color w:val="111827"/>
+                <w:sz w:val="21"/>
+                <w:szCs w:val="21"/>
+              </w:rPr>
+              <w:t xml:space="preserve">Queda registrado en el historial del que lo firmó y todos los bancos lo ven. Un cheque diferido no se paga antes de su fecha.</w:t>
             </w:r>
           </w:p>
         </w:tc>
       </w:tr>
     </w:tbl>
-    <w:p>
-      <w:r>
-        <w:br w:type="page"/>
-      </w:r>
-    </w:p>
-    <w:p>
-      <w:pPr>
-        <w:keepNext/>
-        <w:spacing w:after="90" w:before="300"/>
-      </w:pPr>
-      <w:r>
-        <w:rPr>
-          <w:rFonts w:ascii="Calibri" w:cs="Calibri" w:eastAsia="Calibri" w:hAnsi="Calibri"/>
-          <w:b/>
-          <w:bCs/>
-          <w:color w:val="FFFFFF"/>
-          <w:sz w:val="18"/>
-          <w:szCs w:val="18"/>
-          <w:shd w:fill="5B3FD1" w:color="auto" w:val="clear"/>
-        </w:rPr>
-        <w:t xml:space="preserve"> 8 de 10 </w:t>
-      </w:r>
-      <w:r>
-        <w:rPr>
-          <w:rFonts w:ascii="Calibri" w:cs="Calibri" w:eastAsia="Calibri" w:hAnsi="Calibri"/>
-          <w:color w:val="111827"/>
-          <w:sz w:val="21"/>
-          <w:szCs w:val="21"/>
-        </w:rPr>
-        <w:t xml:space="preserve">  </w:t>
-      </w:r>
-      <w:r>
-        <w:rPr>
-          <w:rFonts w:ascii="Calibri" w:cs="Calibri" w:eastAsia="Calibri" w:hAnsi="Calibri"/>
-          <w:b/>
-          <w:bCs/>
-          <w:color w:val="111827"/>
-          <w:sz w:val="30"/>
-          <w:szCs w:val="30"/>
-        </w:rPr>
-        <w:t xml:space="preserve">La ventanilla</w:t>
-      </w:r>
-      <w:r>
-        <w:rPr>
-          <w:rFonts w:ascii="Calibri" w:cs="Calibri" w:eastAsia="Calibri" w:hAnsi="Calibri"/>
-          <w:color w:val="111827"/>
-          <w:sz w:val="21"/>
-          <w:szCs w:val="21"/>
-        </w:rPr>
-        <w:t xml:space="preserve">   </w:t>
-      </w:r>
-      <w:r>
-        <w:rPr>
-          <w:rFonts w:ascii="Calibri" w:cs="Calibri" w:eastAsia="Calibri" w:hAnsi="Calibri"/>
-          <w:b/>
-          <w:bCs/>
-          <w:color w:val="5B3FD1"/>
-          <w:sz w:val="17"/>
-          <w:szCs w:val="17"/>
-          <w:shd w:fill="EFEBFB" w:color="auto" w:val="clear"/>
-        </w:rPr>
-        <w:t xml:space="preserve"> → Ventanilla </w:t>
-      </w:r>
-    </w:p>
     <w:p>
       <w:pPr>
         <w:keepNext/>
@@ -3574,7 +3681,7 @@
           <w:sz w:val="21"/>
           <w:szCs w:val="21"/>
         </w:rPr>
-        <w:t xml:space="preserve">Entran y salen billetes. Cuenten primero, carguen después.</w:t>
+        <w:t xml:space="preserve">Si el cheque no está cargado en el sistema, lo cargan ustedes con el papel a la vista.</w:t>
       </w:r>
     </w:p>
     <w:p>
@@ -3586,7 +3693,7 @@
       <w:r>
         <w:drawing>
           <wp:inline distT="0" distB="0" distL="0" distR="0">
-            <wp:extent cx="5715000" cy="3505200"/>
+            <wp:extent cx="5715000" cy="5334000"/>
             <wp:effectExtent t="0" r="0" b="0" l="0"/>
             <wp:docPr id="1" name="" descr="" title=""/>
             <wp:cNvGraphicFramePr>
@@ -3611,7 +3718,7 @@
                   <pic:spPr bwMode="auto">
                     <a:xfrm>
                       <a:off x="0" y="0"/>
-                      <a:ext cx="5715000" cy="3505200"/>
+                      <a:ext cx="5715000" cy="5334000"/>
                     </a:xfrm>
                     <a:prstGeom prst="rect">
                       <a:avLst/>
@@ -3678,7 +3785,7 @@
                 <w:sz w:val="20"/>
                 <w:szCs w:val="20"/>
               </w:rPr>
-              <w:t xml:space="preserve">A quién atienden</w:t>
+              <w:t xml:space="preserve">Lo que se queda el banco</w:t>
             </w:r>
           </w:p>
           <w:p>
@@ -3704,7 +3811,33 @@
                 <w:sz w:val="20"/>
                 <w:szCs w:val="20"/>
               </w:rPr>
-              <w:t xml:space="preserve">Cuántos billetes contaron</w:t>
+              <w:t xml:space="preserve">Número del papel</w:t>
+            </w:r>
+          </w:p>
+          <w:p>
+            <w:pPr>
+              <w:spacing w:after="80" w:line="264"/>
+              <w:ind w:left="300" w:hanging="300"/>
+            </w:pPr>
+            <w:r>
+              <w:rPr>
+                <w:rFonts w:ascii="Calibri" w:cs="Calibri" w:eastAsia="Calibri" w:hAnsi="Calibri"/>
+                <w:b/>
+                <w:bCs/>
+                <w:color w:val="D6104A"/>
+                <w:sz w:val="24"/>
+                <w:szCs w:val="24"/>
+              </w:rPr>
+              <w:t xml:space="preserve">③ </w:t>
+            </w:r>
+            <w:r>
+              <w:rPr>
+                <w:rFonts w:ascii="Calibri" w:cs="Calibri" w:eastAsia="Calibri" w:hAnsi="Calibri"/>
+                <w:color w:val="111827"/>
+                <w:sz w:val="20"/>
+                <w:szCs w:val="20"/>
+              </w:rPr>
+              <w:t xml:space="preserve">Importe</w:t>
             </w:r>
           </w:p>
         </w:tc>
@@ -3733,7 +3866,7 @@
                 <w:sz w:val="24"/>
                 <w:szCs w:val="24"/>
               </w:rPr>
-              <w:t xml:space="preserve">③ </w:t>
+              <w:t xml:space="preserve">④ </w:t>
             </w:r>
             <w:r>
               <w:rPr>
@@ -3742,7 +3875,7 @@
                 <w:sz w:val="20"/>
                 <w:szCs w:val="20"/>
               </w:rPr>
-              <w:t xml:space="preserve">De dónde salió esa plata</w:t>
+              <w:t xml:space="preserve">Quién lo firmó</w:t>
             </w:r>
           </w:p>
           <w:p>
@@ -3759,7 +3892,7 @@
                 <w:sz w:val="24"/>
                 <w:szCs w:val="24"/>
               </w:rPr>
-              <w:t xml:space="preserve">④ </w:t>
+              <w:t xml:space="preserve">⑤ </w:t>
             </w:r>
             <w:r>
               <w:rPr>
@@ -3768,7 +3901,33 @@
                 <w:sz w:val="20"/>
                 <w:szCs w:val="20"/>
               </w:rPr>
-              <w:t xml:space="preserve">Entra a la caja</w:t>
+              <w:t xml:space="preserve">A la orden de quién</w:t>
+            </w:r>
+          </w:p>
+          <w:p>
+            <w:pPr>
+              <w:spacing w:after="80" w:line="264"/>
+              <w:ind w:left="300" w:hanging="300"/>
+            </w:pPr>
+            <w:r>
+              <w:rPr>
+                <w:rFonts w:ascii="Calibri" w:cs="Calibri" w:eastAsia="Calibri" w:hAnsi="Calibri"/>
+                <w:b/>
+                <w:bCs/>
+                <w:color w:val="D6104A"/>
+                <w:sz w:val="24"/>
+                <w:szCs w:val="24"/>
+              </w:rPr>
+              <w:t xml:space="preserve">⑥ </w:t>
+            </w:r>
+            <w:r>
+              <w:rPr>
+                <w:rFonts w:ascii="Calibri" w:cs="Calibri" w:eastAsia="Calibri" w:hAnsi="Calibri"/>
+                <w:color w:val="111827"/>
+                <w:sz w:val="20"/>
+                <w:szCs w:val="20"/>
+              </w:rPr>
+              <w:t xml:space="preserve">Desde cuándo se puede cobrar</w:t>
             </w:r>
           </w:p>
         </w:tc>
@@ -3817,21 +3976,26 @@
                 <w:sz w:val="21"/>
                 <w:szCs w:val="21"/>
               </w:rPr>
-              <w:t xml:space="preserve">El depósito suma a la caja del banco y a la cuenta del cliente. </w:t>
-            </w:r>
-            <w:r>
-              <w:rPr>
-                <w:rFonts w:ascii="Calibri" w:cs="Calibri" w:eastAsia="Calibri" w:hAnsi="Calibri"/>
-                <w:color w:val="111827"/>
-                <w:sz w:val="21"/>
-                <w:szCs w:val="21"/>
-              </w:rPr>
-              <w:t xml:space="preserve">La extracción resta de las dos. Si prestaron de más, no les va a alcanzar para pagar un retiro.</w:t>
+              <w:t xml:space="preserve">Nunca lo carga el que lo viene a cobrar. </w:t>
+            </w:r>
+            <w:r>
+              <w:rPr>
+                <w:rFonts w:ascii="Calibri" w:cs="Calibri" w:eastAsia="Calibri" w:hAnsi="Calibri"/>
+                <w:color w:val="111827"/>
+                <w:sz w:val="21"/>
+                <w:szCs w:val="21"/>
+              </w:rPr>
+              <w:t xml:space="preserve">Lo carga el que lo firmó, o ustedes con el papel delante. Para firmar cheques hay que ser cliente de algún banco; si no, no aparece en la lista.</w:t>
             </w:r>
           </w:p>
         </w:tc>
       </w:tr>
     </w:tbl>
+    <w:p>
+      <w:r>
+        <w:br w:type="page"/>
+      </w:r>
+    </w:p>
     <w:p>
       <w:pPr>
         <w:keepNext/>
@@ -3847,7 +4011,7 @@
           <w:szCs w:val="18"/>
           <w:shd w:fill="5B3FD1" w:color="auto" w:val="clear"/>
         </w:rPr>
-        <w:t xml:space="preserve"> 9 de 10 </w:t>
+        <w:t xml:space="preserve"> 9 de 11 </w:t>
       </w:r>
       <w:r>
         <w:rPr>
@@ -3867,7 +4031,7 @@
           <w:sz w:val="30"/>
           <w:szCs w:val="30"/>
         </w:rPr>
-        <w:t xml:space="preserve">La pizarra de tasas</w:t>
+        <w:t xml:space="preserve">La ventanilla</w:t>
       </w:r>
       <w:r>
         <w:rPr>
@@ -3888,7 +4052,7 @@
           <w:szCs w:val="17"/>
           <w:shd w:fill="EFEBFB" w:color="auto" w:val="clear"/>
         </w:rPr>
-        <w:t xml:space="preserve"> → Plazos fijos </w:t>
+        <w:t xml:space="preserve"> → Ventanilla </w:t>
       </w:r>
     </w:p>
     <w:p>
@@ -3903,7 +4067,7 @@
           <w:sz w:val="21"/>
           <w:szCs w:val="21"/>
         </w:rPr>
-        <w:t xml:space="preserve">Es la plata que les dejan guardada. Entra a la caja y la pueden prestar… pero hay que devolverla con interés.</w:t>
+        <w:t xml:space="preserve">Entran y salen billetes. Cuenten primero, carguen después. Sólo atienden a sus clientes: si no aparece el alumno, primero hay que adherirlo en Clientes.</w:t>
       </w:r>
     </w:p>
     <w:p>
@@ -3915,7 +4079,7 @@
       <w:r>
         <w:drawing>
           <wp:inline distT="0" distB="0" distL="0" distR="0">
-            <wp:extent cx="5715000" cy="4238625"/>
+            <wp:extent cx="5715000" cy="3505200"/>
             <wp:effectExtent t="0" r="0" b="0" l="0"/>
             <wp:docPr id="1" name="" descr="" title=""/>
             <wp:cNvGraphicFramePr>
@@ -3940,7 +4104,7 @@
                   <pic:spPr bwMode="auto">
                     <a:xfrm>
                       <a:off x="0" y="0"/>
-                      <a:ext cx="5715000" cy="4238625"/>
+                      <a:ext cx="5715000" cy="3505200"/>
                     </a:xfrm>
                     <a:prstGeom prst="rect">
                       <a:avLst/>
@@ -4007,7 +4171,7 @@
                 <w:sz w:val="20"/>
                 <w:szCs w:val="20"/>
               </w:rPr>
-              <w:t xml:space="preserve">Lo que pagan contra lo que cobran</w:t>
+              <w:t xml:space="preserve">A quién atienden</w:t>
             </w:r>
           </w:p>
           <w:p>
@@ -4033,33 +4197,7 @@
                 <w:sz w:val="20"/>
                 <w:szCs w:val="20"/>
               </w:rPr>
-              <w:t xml:space="preserve">Los plazos que ofrecen hoy</w:t>
-            </w:r>
-          </w:p>
-          <w:p>
-            <w:pPr>
-              <w:spacing w:after="80" w:line="264"/>
-              <w:ind w:left="300" w:hanging="300"/>
-            </w:pPr>
-            <w:r>
-              <w:rPr>
-                <w:rFonts w:ascii="Calibri" w:cs="Calibri" w:eastAsia="Calibri" w:hAnsi="Calibri"/>
-                <w:b/>
-                <w:bCs/>
-                <w:color w:val="D6104A"/>
-                <w:sz w:val="24"/>
-                <w:szCs w:val="24"/>
-              </w:rPr>
-              <w:t xml:space="preserve">③ </w:t>
-            </w:r>
-            <w:r>
-              <w:rPr>
-                <w:rFonts w:ascii="Calibri" w:cs="Calibri" w:eastAsia="Calibri" w:hAnsi="Calibri"/>
-                <w:color w:val="111827"/>
-                <w:sz w:val="20"/>
-                <w:szCs w:val="20"/>
-              </w:rPr>
-              <w:t xml:space="preserve">Por cuántos días</w:t>
+              <w:t xml:space="preserve">Cuántos billetes contaron</w:t>
             </w:r>
           </w:p>
         </w:tc>
@@ -4088,7 +4226,7 @@
                 <w:sz w:val="24"/>
                 <w:szCs w:val="24"/>
               </w:rPr>
-              <w:t xml:space="preserve">④ </w:t>
+              <w:t xml:space="preserve">③ </w:t>
             </w:r>
             <w:r>
               <w:rPr>
@@ -4097,7 +4235,7 @@
                 <w:sz w:val="20"/>
                 <w:szCs w:val="20"/>
               </w:rPr>
-              <w:t xml:space="preserve">Cuánto pagan por año (TNA)</w:t>
+              <w:t xml:space="preserve">De dónde salió esa plata</w:t>
             </w:r>
           </w:p>
           <w:p>
@@ -4114,7 +4252,7 @@
                 <w:sz w:val="24"/>
                 <w:szCs w:val="24"/>
               </w:rPr>
-              <w:t xml:space="preserve">⑤ </w:t>
+              <w:t xml:space="preserve">④ </w:t>
             </w:r>
             <w:r>
               <w:rPr>
@@ -4123,7 +4261,7 @@
                 <w:sz w:val="20"/>
                 <w:szCs w:val="20"/>
               </w:rPr>
-              <w:t xml:space="preserve">Queda en la pizarra</w:t>
+              <w:t xml:space="preserve">Entra a la caja</w:t>
             </w:r>
           </w:p>
         </w:tc>
@@ -4134,7 +4272,7 @@
         <w:tblW w:type="dxa" w:w="9026"/>
         <w:tblBorders>
           <w:top w:val="none" w:color="FFFFFF" w:sz="0"/>
-          <w:left w:val="single" w:color="D6104A" w:sz="18"/>
+          <w:left w:val="single" w:color="5B3FD1" w:sz="18"/>
           <w:bottom w:val="none" w:color="FFFFFF" w:sz="0"/>
           <w:right w:val="none" w:color="FFFFFF" w:sz="0"/>
           <w:insideH w:val="none" w:color="FFFFFF" w:sz="0"/>
@@ -4151,7 +4289,7 @@
         <w:tc>
           <w:tcPr>
             <w:tcW w:type="dxa" w:w="9026"/>
-            <w:shd w:fill="FDEEF1" w:color="auto" w:val="clear"/>
+            <w:shd w:fill="EFEBFB" w:color="auto" w:val="clear"/>
             <w:tcMar>
               <w:top w:type="dxa" w:w="120"/>
               <w:left w:type="dxa" w:w="160"/>
@@ -4168,20 +4306,20 @@
                 <w:rFonts w:ascii="Calibri" w:cs="Calibri" w:eastAsia="Calibri" w:hAnsi="Calibri"/>
                 <w:b/>
                 <w:bCs/>
-                <w:color w:val="D6104A"/>
-                <w:sz w:val="21"/>
-                <w:szCs w:val="21"/>
-              </w:rPr>
-              <w:t xml:space="preserve">Nunca paguen más de lo que cobran prestando. </w:t>
-            </w:r>
-            <w:r>
-              <w:rPr>
-                <w:rFonts w:ascii="Calibri" w:cs="Calibri" w:eastAsia="Calibri" w:hAnsi="Calibri"/>
-                <w:color w:val="111827"/>
-                <w:sz w:val="21"/>
-                <w:szCs w:val="21"/>
-              </w:rPr>
-              <w:t xml:space="preserve">Ahí está la ganancia del banco: la diferencia entre las dos tasas.</w:t>
+                <w:color w:val="5B3FD1"/>
+                <w:sz w:val="21"/>
+                <w:szCs w:val="21"/>
+              </w:rPr>
+              <w:t xml:space="preserve">El depósito suma a la caja del banco y a la cuenta del cliente. </w:t>
+            </w:r>
+            <w:r>
+              <w:rPr>
+                <w:rFonts w:ascii="Calibri" w:cs="Calibri" w:eastAsia="Calibri" w:hAnsi="Calibri"/>
+                <w:color w:val="111827"/>
+                <w:sz w:val="21"/>
+                <w:szCs w:val="21"/>
+              </w:rPr>
+              <w:t xml:space="preserve">La extracción resta de las dos. Si prestaron de más, no les va a alcanzar para pagar un retiro.</w:t>
             </w:r>
           </w:p>
         </w:tc>
@@ -4202,7 +4340,7 @@
           <w:szCs w:val="18"/>
           <w:shd w:fill="5B3FD1" w:color="auto" w:val="clear"/>
         </w:rPr>
-        <w:t xml:space="preserve"> 10 de 10 </w:t>
+        <w:t xml:space="preserve"> 10 de 11 </w:t>
       </w:r>
       <w:r>
         <w:rPr>
@@ -4222,7 +4360,7 @@
           <w:sz w:val="30"/>
           <w:szCs w:val="30"/>
         </w:rPr>
-        <w:t xml:space="preserve">La cuenta del banco</w:t>
+        <w:t xml:space="preserve">La pizarra de tasas</w:t>
       </w:r>
       <w:r>
         <w:rPr>
@@ -4243,7 +4381,7 @@
           <w:szCs w:val="17"/>
           <w:shd w:fill="EFEBFB" w:color="auto" w:val="clear"/>
         </w:rPr>
-        <w:t xml:space="preserve"> → Cuenta </w:t>
+        <w:t xml:space="preserve"> → Plazos fijos </w:t>
       </w:r>
     </w:p>
     <w:p>
@@ -4258,7 +4396,7 @@
           <w:sz w:val="21"/>
           <w:szCs w:val="21"/>
         </w:rPr>
-        <w:t xml:space="preserve">Todo lo que hicieron en el día, en una lista. Acá se ve si el banco gana o pierde.</w:t>
+        <w:t xml:space="preserve">Es la plata que sus clientes les dejan guardada. Entra a la caja y la pueden prestar… pero hay que devolverla con interés.</w:t>
       </w:r>
     </w:p>
     <w:p>
@@ -4270,7 +4408,7 @@
       <w:r>
         <w:drawing>
           <wp:inline distT="0" distB="0" distL="0" distR="0">
-            <wp:extent cx="5715000" cy="1609725"/>
+            <wp:extent cx="5715000" cy="4238625"/>
             <wp:effectExtent t="0" r="0" b="0" l="0"/>
             <wp:docPr id="1" name="" descr="" title=""/>
             <wp:cNvGraphicFramePr>
@@ -4295,7 +4433,7 @@
                   <pic:spPr bwMode="auto">
                     <a:xfrm>
                       <a:off x="0" y="0"/>
-                      <a:ext cx="5715000" cy="1609725"/>
+                      <a:ext cx="5715000" cy="4238625"/>
                     </a:xfrm>
                     <a:prstGeom prst="rect">
                       <a:avLst/>
@@ -4362,7 +4500,7 @@
                 <w:sz w:val="20"/>
                 <w:szCs w:val="20"/>
               </w:rPr>
-              <w:t xml:space="preserve">Lo que hay ahora</w:t>
+              <w:t xml:space="preserve">Lo que pagan contra lo que cobran</w:t>
             </w:r>
           </w:p>
           <w:p>
@@ -4388,7 +4526,33 @@
                 <w:sz w:val="20"/>
                 <w:szCs w:val="20"/>
               </w:rPr>
-              <w:t xml:space="preserve">Todo lo que entró</w:t>
+              <w:t xml:space="preserve">Los plazos que ofrecen hoy</w:t>
+            </w:r>
+          </w:p>
+          <w:p>
+            <w:pPr>
+              <w:spacing w:after="80" w:line="264"/>
+              <w:ind w:left="300" w:hanging="300"/>
+            </w:pPr>
+            <w:r>
+              <w:rPr>
+                <w:rFonts w:ascii="Calibri" w:cs="Calibri" w:eastAsia="Calibri" w:hAnsi="Calibri"/>
+                <w:b/>
+                <w:bCs/>
+                <w:color w:val="D6104A"/>
+                <w:sz w:val="24"/>
+                <w:szCs w:val="24"/>
+              </w:rPr>
+              <w:t xml:space="preserve">③ </w:t>
+            </w:r>
+            <w:r>
+              <w:rPr>
+                <w:rFonts w:ascii="Calibri" w:cs="Calibri" w:eastAsia="Calibri" w:hAnsi="Calibri"/>
+                <w:color w:val="111827"/>
+                <w:sz w:val="20"/>
+                <w:szCs w:val="20"/>
+              </w:rPr>
+              <w:t xml:space="preserve">Por cuántos días</w:t>
             </w:r>
           </w:p>
         </w:tc>
@@ -4417,7 +4581,7 @@
                 <w:sz w:val="24"/>
                 <w:szCs w:val="24"/>
               </w:rPr>
-              <w:t xml:space="preserve">③ </w:t>
+              <w:t xml:space="preserve">④ </w:t>
             </w:r>
             <w:r>
               <w:rPr>
@@ -4426,23 +4590,122 @@
                 <w:sz w:val="20"/>
                 <w:szCs w:val="20"/>
               </w:rPr>
-              <w:t xml:space="preserve">Todo lo que salió</w:t>
+              <w:t xml:space="preserve">Cuánto pagan por año (TNA)</w:t>
+            </w:r>
+          </w:p>
+          <w:p>
+            <w:pPr>
+              <w:spacing w:after="80" w:line="264"/>
+              <w:ind w:left="300" w:hanging="300"/>
+            </w:pPr>
+            <w:r>
+              <w:rPr>
+                <w:rFonts w:ascii="Calibri" w:cs="Calibri" w:eastAsia="Calibri" w:hAnsi="Calibri"/>
+                <w:b/>
+                <w:bCs/>
+                <w:color w:val="D6104A"/>
+                <w:sz w:val="24"/>
+                <w:szCs w:val="24"/>
+              </w:rPr>
+              <w:t xml:space="preserve">⑤ </w:t>
+            </w:r>
+            <w:r>
+              <w:rPr>
+                <w:rFonts w:ascii="Calibri" w:cs="Calibri" w:eastAsia="Calibri" w:hAnsi="Calibri"/>
+                <w:color w:val="111827"/>
+                <w:sz w:val="20"/>
+                <w:szCs w:val="20"/>
+              </w:rPr>
+              <w:t xml:space="preserve">Queda en la pizarra</w:t>
+            </w:r>
+          </w:p>
+        </w:tc>
+      </w:tr>
+    </w:tbl>
+    <w:tbl>
+      <w:tblPr>
+        <w:tblW w:type="dxa" w:w="9026"/>
+        <w:tblBorders>
+          <w:top w:val="none" w:color="FFFFFF" w:sz="0"/>
+          <w:left w:val="single" w:color="D6104A" w:sz="18"/>
+          <w:bottom w:val="none" w:color="FFFFFF" w:sz="0"/>
+          <w:right w:val="none" w:color="FFFFFF" w:sz="0"/>
+          <w:insideH w:val="none" w:color="FFFFFF" w:sz="0"/>
+          <w:insideV w:val="none" w:color="FFFFFF" w:sz="0"/>
+        </w:tblBorders>
+      </w:tblPr>
+      <w:tblGrid>
+        <w:gridCol w:w="9026"/>
+      </w:tblGrid>
+      <w:tr>
+        <w:trPr>
+          <w:cantSplit/>
+        </w:trPr>
+        <w:tc>
+          <w:tcPr>
+            <w:tcW w:type="dxa" w:w="9026"/>
+            <w:shd w:fill="FDEEF1" w:color="auto" w:val="clear"/>
+            <w:tcMar>
+              <w:top w:type="dxa" w:w="120"/>
+              <w:left w:type="dxa" w:w="160"/>
+              <w:bottom w:type="dxa" w:w="120"/>
+              <w:right w:type="dxa" w:w="160"/>
+            </w:tcMar>
+          </w:tcPr>
+          <w:p>
+            <w:pPr>
+              <w:spacing w:line="276"/>
+            </w:pPr>
+            <w:r>
+              <w:rPr>
+                <w:rFonts w:ascii="Calibri" w:cs="Calibri" w:eastAsia="Calibri" w:hAnsi="Calibri"/>
+                <w:b/>
+                <w:bCs/>
+                <w:color w:val="D6104A"/>
+                <w:sz w:val="21"/>
+                <w:szCs w:val="21"/>
+              </w:rPr>
+              <w:t xml:space="preserve">Nunca paguen más de lo que cobran prestando. </w:t>
+            </w:r>
+            <w:r>
+              <w:rPr>
+                <w:rFonts w:ascii="Calibri" w:cs="Calibri" w:eastAsia="Calibri" w:hAnsi="Calibri"/>
+                <w:color w:val="111827"/>
+                <w:sz w:val="21"/>
+                <w:szCs w:val="21"/>
+              </w:rPr>
+              <w:t xml:space="preserve">Ahí está la ganancia del banco: la diferencia entre las dos tasas.</w:t>
             </w:r>
           </w:p>
         </w:tc>
       </w:tr>
     </w:tbl>
     <w:p>
-      <w:r>
-        <w:br w:type="page"/>
-      </w:r>
-    </w:p>
-    <w:p>
       <w:pPr>
-        <w:pStyle w:val="Heading1"/>
         <w:keepNext/>
-        <w:spacing w:after="140" w:before="320"/>
+        <w:spacing w:after="90" w:before="300"/>
       </w:pPr>
+      <w:r>
+        <w:rPr>
+          <w:rFonts w:ascii="Calibri" w:cs="Calibri" w:eastAsia="Calibri" w:hAnsi="Calibri"/>
+          <w:b/>
+          <w:bCs/>
+          <w:color w:val="FFFFFF"/>
+          <w:sz w:val="18"/>
+          <w:szCs w:val="18"/>
+          <w:shd w:fill="5B3FD1" w:color="auto" w:val="clear"/>
+        </w:rPr>
+        <w:t xml:space="preserve"> 11 de 11 </w:t>
+      </w:r>
+      <w:r>
+        <w:rPr>
+          <w:rFonts w:ascii="Calibri" w:cs="Calibri" w:eastAsia="Calibri" w:hAnsi="Calibri"/>
+          <w:color w:val="111827"/>
+          <w:sz w:val="21"/>
+          <w:szCs w:val="21"/>
+        </w:rPr>
+        <w:t xml:space="preserve">  </w:t>
+      </w:r>
       <w:r>
         <w:rPr>
           <w:rFonts w:ascii="Calibri" w:cs="Calibri" w:eastAsia="Calibri" w:hAnsi="Calibri"/>
@@ -4452,7 +4715,90 @@
           <w:sz w:val="30"/>
           <w:szCs w:val="30"/>
         </w:rPr>
-        <w:t xml:space="preserve">Cuatro reglas del mostrador</w:t>
+        <w:t xml:space="preserve">La cuenta del banco</w:t>
+      </w:r>
+      <w:r>
+        <w:rPr>
+          <w:rFonts w:ascii="Calibri" w:cs="Calibri" w:eastAsia="Calibri" w:hAnsi="Calibri"/>
+          <w:color w:val="111827"/>
+          <w:sz w:val="21"/>
+          <w:szCs w:val="21"/>
+        </w:rPr>
+        <w:t xml:space="preserve">   </w:t>
+      </w:r>
+      <w:r>
+        <w:rPr>
+          <w:rFonts w:ascii="Calibri" w:cs="Calibri" w:eastAsia="Calibri" w:hAnsi="Calibri"/>
+          <w:b/>
+          <w:bCs/>
+          <w:color w:val="5B3FD1"/>
+          <w:sz w:val="17"/>
+          <w:szCs w:val="17"/>
+          <w:shd w:fill="EFEBFB" w:color="auto" w:val="clear"/>
+        </w:rPr>
+        <w:t xml:space="preserve"> → Cuenta </w:t>
+      </w:r>
+    </w:p>
+    <w:p>
+      <w:pPr>
+        <w:keepNext/>
+        <w:spacing w:after="100" w:line="276"/>
+      </w:pPr>
+      <w:r>
+        <w:rPr>
+          <w:rFonts w:ascii="Calibri" w:cs="Calibri" w:eastAsia="Calibri" w:hAnsi="Calibri"/>
+          <w:color w:val="111827"/>
+          <w:sz w:val="21"/>
+          <w:szCs w:val="21"/>
+        </w:rPr>
+        <w:t xml:space="preserve">Todo lo que hicieron en el día, en una lista. Acá se ve si el banco gana o pierde.</w:t>
+      </w:r>
+    </w:p>
+    <w:p>
+      <w:pPr>
+        <w:keepNext/>
+        <w:spacing w:after="100" w:before="60"/>
+        <w:jc w:val="center"/>
+      </w:pPr>
+      <w:r>
+        <w:drawing>
+          <wp:inline distT="0" distB="0" distL="0" distR="0">
+            <wp:extent cx="5715000" cy="1609725"/>
+            <wp:effectExtent t="0" r="0" b="0" l="0"/>
+            <wp:docPr id="1" name="" descr="" title=""/>
+            <wp:cNvGraphicFramePr>
+              <a:graphicFrameLocks xmlns:a="http://schemas.openxmlformats.org/drawingml/2006/main" noChangeAspect="1"/>
+            </wp:cNvGraphicFramePr>
+            <a:graphic xmlns:a="http://schemas.openxmlformats.org/drawingml/2006/main">
+              <a:graphicData uri="http://schemas.openxmlformats.org/drawingml/2006/picture">
+                <pic:pic xmlns:pic="http://schemas.openxmlformats.org/drawingml/2006/picture">
+                  <pic:nvPicPr>
+                    <pic:cNvPr id="0" name="" descr=""/>
+                    <pic:cNvPicPr>
+                      <a:picLocks noChangeAspect="1" noChangeArrowheads="1"/>
+                    </pic:cNvPicPr>
+                  </pic:nvPicPr>
+                  <pic:blipFill>
+                    <a:blip r:embed="rId22" cstate="none"/>
+                    <a:srcRect/>
+                    <a:stretch>
+                      <a:fillRect/>
+                    </a:stretch>
+                  </pic:blipFill>
+                  <pic:spPr bwMode="auto">
+                    <a:xfrm>
+                      <a:off x="0" y="0"/>
+                      <a:ext cx="5715000" cy="1609725"/>
+                    </a:xfrm>
+                    <a:prstGeom prst="rect">
+                      <a:avLst/>
+                    </a:prstGeom>
+                  </pic:spPr>
+                </pic:pic>
+              </a:graphicData>
+            </a:graphic>
+          </wp:inline>
+        </w:drawing>
       </w:r>
     </w:p>
     <w:tbl>
@@ -4478,111 +4824,128 @@
         <w:tc>
           <w:tcPr>
             <w:tcW w:type="dxa" w:w="4513"/>
-            <w:tcBorders>
-              <w:top w:val="single" w:color="E2E6EA" w:sz="4"/>
-              <w:left w:val="single" w:color="E2E6EA" w:sz="4"/>
-              <w:bottom w:val="single" w:color="E2E6EA" w:sz="4"/>
-              <w:right w:val="single" w:color="E2E6EA" w:sz="4"/>
-            </w:tcBorders>
-            <w:tcMar>
-              <w:top w:type="dxa" w:w="120"/>
+            <w:tcMar>
+              <w:top w:type="dxa" w:w="40"/>
+              <w:left w:type="dxa" w:w="0"/>
+              <w:bottom w:type="dxa" w:w="40"/>
+              <w:right w:type="dxa" w:w="100"/>
+            </w:tcMar>
+            <w:vAlign w:val="top"/>
+          </w:tcPr>
+          <w:p>
+            <w:pPr>
+              <w:spacing w:after="80" w:line="264"/>
+              <w:ind w:left="300" w:hanging="300"/>
+            </w:pPr>
+            <w:r>
+              <w:rPr>
+                <w:rFonts w:ascii="Calibri" w:cs="Calibri" w:eastAsia="Calibri" w:hAnsi="Calibri"/>
+                <w:b/>
+                <w:bCs/>
+                <w:color w:val="D6104A"/>
+                <w:sz w:val="24"/>
+                <w:szCs w:val="24"/>
+              </w:rPr>
+              <w:t xml:space="preserve">① </w:t>
+            </w:r>
+            <w:r>
+              <w:rPr>
+                <w:rFonts w:ascii="Calibri" w:cs="Calibri" w:eastAsia="Calibri" w:hAnsi="Calibri"/>
+                <w:color w:val="111827"/>
+                <w:sz w:val="20"/>
+                <w:szCs w:val="20"/>
+              </w:rPr>
+              <w:t xml:space="preserve">Lo que hay ahora</w:t>
+            </w:r>
+          </w:p>
+          <w:p>
+            <w:pPr>
+              <w:spacing w:after="80" w:line="264"/>
+              <w:ind w:left="300" w:hanging="300"/>
+            </w:pPr>
+            <w:r>
+              <w:rPr>
+                <w:rFonts w:ascii="Calibri" w:cs="Calibri" w:eastAsia="Calibri" w:hAnsi="Calibri"/>
+                <w:b/>
+                <w:bCs/>
+                <w:color w:val="D6104A"/>
+                <w:sz w:val="24"/>
+                <w:szCs w:val="24"/>
+              </w:rPr>
+              <w:t xml:space="preserve">② </w:t>
+            </w:r>
+            <w:r>
+              <w:rPr>
+                <w:rFonts w:ascii="Calibri" w:cs="Calibri" w:eastAsia="Calibri" w:hAnsi="Calibri"/>
+                <w:color w:val="111827"/>
+                <w:sz w:val="20"/>
+                <w:szCs w:val="20"/>
+              </w:rPr>
+              <w:t xml:space="preserve">Todo lo que entró</w:t>
+            </w:r>
+          </w:p>
+        </w:tc>
+        <w:tc>
+          <w:tcPr>
+            <w:tcW w:type="dxa" w:w="4513"/>
+            <w:tcMar>
+              <w:top w:type="dxa" w:w="40"/>
               <w:left w:type="dxa" w:w="140"/>
-              <w:bottom w:type="dxa" w:w="120"/>
-              <w:right w:type="dxa" w:w="140"/>
-            </w:tcMar>
-          </w:tcPr>
-          <w:p>
-            <w:pPr>
-              <w:spacing w:after="60"/>
-            </w:pPr>
-            <w:r>
-              <w:rPr>
-                <w:rFonts w:ascii="Calibri" w:cs="Calibri" w:eastAsia="Calibri" w:hAnsi="Calibri"/>
-                <w:b/>
-                <w:bCs/>
-                <w:color w:val="111827"/>
-                <w:sz w:val="21"/>
-                <w:szCs w:val="21"/>
-              </w:rPr>
-              <w:t xml:space="preserve">Miren la caja antes de decir que sí</w:t>
-            </w:r>
-          </w:p>
-          <w:p>
-            <w:pPr>
-              <w:spacing w:line="264"/>
-            </w:pPr>
-            <w:r>
-              <w:rPr>
-                <w:rFonts w:ascii="Calibri" w:cs="Calibri" w:eastAsia="Calibri" w:hAnsi="Calibri"/>
-                <w:color w:val="374151"/>
-                <w:sz w:val="19"/>
-                <w:szCs w:val="19"/>
-              </w:rPr>
-              <w:t xml:space="preserve">Prestar es fácil; pagar cuando vengan todos juntos, no.</w:t>
-            </w:r>
-          </w:p>
-        </w:tc>
-        <w:tc>
-          <w:tcPr>
-            <w:tcW w:type="dxa" w:w="4513"/>
-            <w:tcBorders>
-              <w:top w:val="single" w:color="E2E6EA" w:sz="4"/>
-              <w:left w:val="single" w:color="E2E6EA" w:sz="4"/>
-              <w:bottom w:val="single" w:color="E2E6EA" w:sz="4"/>
-              <w:right w:val="single" w:color="E2E6EA" w:sz="4"/>
-            </w:tcBorders>
-            <w:tcMar>
-              <w:top w:type="dxa" w:w="120"/>
-              <w:left w:type="dxa" w:w="140"/>
-              <w:bottom w:type="dxa" w:w="120"/>
-              <w:right w:type="dxa" w:w="140"/>
-            </w:tcMar>
-          </w:tcPr>
-          <w:p>
-            <w:pPr>
-              <w:spacing w:after="60"/>
-            </w:pPr>
-            <w:r>
-              <w:rPr>
-                <w:rFonts w:ascii="Calibri" w:cs="Calibri" w:eastAsia="Calibri" w:hAnsi="Calibri"/>
-                <w:b/>
-                <w:bCs/>
-                <w:color w:val="111827"/>
-                <w:sz w:val="21"/>
-                <w:szCs w:val="21"/>
-              </w:rPr>
-              <w:t xml:space="preserve">Lo que aprueban queda a su nombre</w:t>
-            </w:r>
-          </w:p>
-          <w:p>
-            <w:pPr>
-              <w:spacing w:line="264"/>
-            </w:pPr>
-            <w:r>
-              <w:rPr>
-                <w:rFonts w:ascii="Calibri" w:cs="Calibri" w:eastAsia="Calibri" w:hAnsi="Calibri"/>
-                <w:color w:val="374151"/>
-                <w:sz w:val="19"/>
-                <w:szCs w:val="19"/>
-              </w:rPr>
-              <w:t xml:space="preserve">Cada decisión guarda quién la tomó. No presten la contraseña.</w:t>
+              <w:bottom w:type="dxa" w:w="40"/>
+              <w:right w:type="dxa" w:w="100"/>
+            </w:tcMar>
+            <w:vAlign w:val="top"/>
+          </w:tcPr>
+          <w:p>
+            <w:pPr>
+              <w:spacing w:after="80" w:line="264"/>
+              <w:ind w:left="300" w:hanging="300"/>
+            </w:pPr>
+            <w:r>
+              <w:rPr>
+                <w:rFonts w:ascii="Calibri" w:cs="Calibri" w:eastAsia="Calibri" w:hAnsi="Calibri"/>
+                <w:b/>
+                <w:bCs/>
+                <w:color w:val="D6104A"/>
+                <w:sz w:val="24"/>
+                <w:szCs w:val="24"/>
+              </w:rPr>
+              <w:t xml:space="preserve">③ </w:t>
+            </w:r>
+            <w:r>
+              <w:rPr>
+                <w:rFonts w:ascii="Calibri" w:cs="Calibri" w:eastAsia="Calibri" w:hAnsi="Calibri"/>
+                <w:color w:val="111827"/>
+                <w:sz w:val="20"/>
+                <w:szCs w:val="20"/>
+              </w:rPr>
+              <w:t xml:space="preserve">Todo lo que salió</w:t>
             </w:r>
           </w:p>
         </w:tc>
       </w:tr>
     </w:tbl>
     <w:p>
+      <w:r>
+        <w:br w:type="page"/>
+      </w:r>
+    </w:p>
+    <w:p>
       <w:pPr>
-        <w:spacing w:after="100"/>
+        <w:pStyle w:val="Heading1"/>
+        <w:keepNext/>
+        <w:spacing w:after="140" w:before="320"/>
       </w:pPr>
       <w:r>
         <w:rPr>
           <w:rFonts w:ascii="Calibri" w:cs="Calibri" w:eastAsia="Calibri" w:hAnsi="Calibri"/>
+          <w:b/>
+          <w:bCs/>
           <w:color w:val="111827"/>
-          <w:sz w:val="21"/>
-          <w:szCs w:val="21"/>
-        </w:rPr>
-        <w:t xml:space="preserve"/>
+          <w:sz w:val="30"/>
+          <w:szCs w:val="30"/>
+        </w:rPr>
+        <w:t xml:space="preserve">Cinco reglas del mostrador</w:t>
       </w:r>
     </w:p>
     <w:tbl>
@@ -4634,7 +4997,7 @@
                 <w:sz w:val="21"/>
                 <w:szCs w:val="21"/>
               </w:rPr>
-              <w:t xml:space="preserve">El papel y la app tienen que coincidir</w:t>
+              <w:t xml:space="preserve">Primero el alta, después el servicio</w:t>
             </w:r>
           </w:p>
           <w:p>
@@ -4648,13 +5011,191 @@
                 <w:sz w:val="19"/>
                 <w:szCs w:val="19"/>
               </w:rPr>
+              <w:t xml:space="preserve">Nada se le da a un alumno que no esté adherido a su banco.</w:t>
+            </w:r>
+          </w:p>
+        </w:tc>
+        <w:tc>
+          <w:tcPr>
+            <w:tcW w:type="dxa" w:w="4513"/>
+            <w:tcBorders>
+              <w:top w:val="single" w:color="E2E6EA" w:sz="4"/>
+              <w:left w:val="single" w:color="E2E6EA" w:sz="4"/>
+              <w:bottom w:val="single" w:color="E2E6EA" w:sz="4"/>
+              <w:right w:val="single" w:color="E2E6EA" w:sz="4"/>
+            </w:tcBorders>
+            <w:tcMar>
+              <w:top w:type="dxa" w:w="120"/>
+              <w:left w:type="dxa" w:w="140"/>
+              <w:bottom w:type="dxa" w:w="120"/>
+              <w:right w:type="dxa" w:w="140"/>
+            </w:tcMar>
+          </w:tcPr>
+          <w:p>
+            <w:pPr>
+              <w:spacing w:after="60"/>
+            </w:pPr>
+            <w:r>
+              <w:rPr>
+                <w:rFonts w:ascii="Calibri" w:cs="Calibri" w:eastAsia="Calibri" w:hAnsi="Calibri"/>
+                <w:b/>
+                <w:bCs/>
+                <w:color w:val="111827"/>
+                <w:sz w:val="21"/>
+                <w:szCs w:val="21"/>
+              </w:rPr>
+              <w:t xml:space="preserve">Miren la caja antes de decir que sí</w:t>
+            </w:r>
+          </w:p>
+          <w:p>
+            <w:pPr>
+              <w:spacing w:line="264"/>
+            </w:pPr>
+            <w:r>
+              <w:rPr>
+                <w:rFonts w:ascii="Calibri" w:cs="Calibri" w:eastAsia="Calibri" w:hAnsi="Calibri"/>
+                <w:color w:val="374151"/>
+                <w:sz w:val="19"/>
+                <w:szCs w:val="19"/>
+              </w:rPr>
+              <w:t xml:space="preserve">Prestar es fácil; pagar cuando vengan todos juntos, no.</w:t>
+            </w:r>
+          </w:p>
+        </w:tc>
+      </w:tr>
+    </w:tbl>
+    <w:p>
+      <w:pPr>
+        <w:spacing w:after="100"/>
+      </w:pPr>
+      <w:r>
+        <w:rPr>
+          <w:rFonts w:ascii="Calibri" w:cs="Calibri" w:eastAsia="Calibri" w:hAnsi="Calibri"/>
+          <w:color w:val="111827"/>
+          <w:sz w:val="21"/>
+          <w:szCs w:val="21"/>
+        </w:rPr>
+        <w:t xml:space="preserve"/>
+      </w:r>
+    </w:p>
+    <w:tbl>
+      <w:tblPr>
+        <w:tblW w:type="dxa" w:w="9024"/>
+        <w:tblBorders>
+          <w:top w:val="none" w:color="FFFFFF" w:sz="0"/>
+          <w:left w:val="none" w:color="FFFFFF" w:sz="0"/>
+          <w:bottom w:val="none" w:color="FFFFFF" w:sz="0"/>
+          <w:right w:val="none" w:color="FFFFFF" w:sz="0"/>
+          <w:insideH w:val="none" w:color="FFFFFF" w:sz="0"/>
+          <w:insideV w:val="none" w:color="FFFFFF" w:sz="0"/>
+        </w:tblBorders>
+      </w:tblPr>
+      <w:tblGrid>
+        <w:gridCol w:w="3008"/>
+        <w:gridCol w:w="3008"/>
+        <w:gridCol w:w="3008"/>
+      </w:tblGrid>
+      <w:tr>
+        <w:trPr>
+          <w:cantSplit/>
+        </w:trPr>
+        <w:tc>
+          <w:tcPr>
+            <w:tcW w:type="dxa" w:w="3008"/>
+            <w:tcBorders>
+              <w:top w:val="single" w:color="E2E6EA" w:sz="4"/>
+              <w:left w:val="single" w:color="E2E6EA" w:sz="4"/>
+              <w:bottom w:val="single" w:color="E2E6EA" w:sz="4"/>
+              <w:right w:val="single" w:color="E2E6EA" w:sz="4"/>
+            </w:tcBorders>
+            <w:tcMar>
+              <w:top w:type="dxa" w:w="120"/>
+              <w:left w:type="dxa" w:w="140"/>
+              <w:bottom w:type="dxa" w:w="120"/>
+              <w:right w:type="dxa" w:w="140"/>
+            </w:tcMar>
+          </w:tcPr>
+          <w:p>
+            <w:pPr>
+              <w:spacing w:after="60"/>
+            </w:pPr>
+            <w:r>
+              <w:rPr>
+                <w:rFonts w:ascii="Calibri" w:cs="Calibri" w:eastAsia="Calibri" w:hAnsi="Calibri"/>
+                <w:b/>
+                <w:bCs/>
+                <w:color w:val="111827"/>
+                <w:sz w:val="21"/>
+                <w:szCs w:val="21"/>
+              </w:rPr>
+              <w:t xml:space="preserve">Lo que aprueban queda a su nombre</w:t>
+            </w:r>
+          </w:p>
+          <w:p>
+            <w:pPr>
+              <w:spacing w:line="264"/>
+            </w:pPr>
+            <w:r>
+              <w:rPr>
+                <w:rFonts w:ascii="Calibri" w:cs="Calibri" w:eastAsia="Calibri" w:hAnsi="Calibri"/>
+                <w:color w:val="374151"/>
+                <w:sz w:val="19"/>
+                <w:szCs w:val="19"/>
+              </w:rPr>
+              <w:t xml:space="preserve">Cada decisión guarda quién la tomó. No presten la contraseña.</w:t>
+            </w:r>
+          </w:p>
+        </w:tc>
+        <w:tc>
+          <w:tcPr>
+            <w:tcW w:type="dxa" w:w="3008"/>
+            <w:tcBorders>
+              <w:top w:val="single" w:color="E2E6EA" w:sz="4"/>
+              <w:left w:val="single" w:color="E2E6EA" w:sz="4"/>
+              <w:bottom w:val="single" w:color="E2E6EA" w:sz="4"/>
+              <w:right w:val="single" w:color="E2E6EA" w:sz="4"/>
+            </w:tcBorders>
+            <w:tcMar>
+              <w:top w:type="dxa" w:w="120"/>
+              <w:left w:type="dxa" w:w="140"/>
+              <w:bottom w:type="dxa" w:w="120"/>
+              <w:right w:type="dxa" w:w="140"/>
+            </w:tcMar>
+          </w:tcPr>
+          <w:p>
+            <w:pPr>
+              <w:spacing w:after="60"/>
+            </w:pPr>
+            <w:r>
+              <w:rPr>
+                <w:rFonts w:ascii="Calibri" w:cs="Calibri" w:eastAsia="Calibri" w:hAnsi="Calibri"/>
+                <w:b/>
+                <w:bCs/>
+                <w:color w:val="111827"/>
+                <w:sz w:val="21"/>
+                <w:szCs w:val="21"/>
+              </w:rPr>
+              <w:t xml:space="preserve">El papel y la app tienen que coincidir</w:t>
+            </w:r>
+          </w:p>
+          <w:p>
+            <w:pPr>
+              <w:spacing w:line="264"/>
+            </w:pPr>
+            <w:r>
+              <w:rPr>
+                <w:rFonts w:ascii="Calibri" w:cs="Calibri" w:eastAsia="Calibri" w:hAnsi="Calibri"/>
+                <w:color w:val="374151"/>
+                <w:sz w:val="19"/>
+                <w:szCs w:val="19"/>
+              </w:rPr>
               <w:t xml:space="preserve">La tarjeta y el cheque de cartón son el original; la app es el espejo.</w:t>
             </w:r>
           </w:p>
         </w:tc>
         <w:tc>
           <w:tcPr>
-            <w:tcW w:type="dxa" w:w="4513"/>
+            <w:tcW w:type="dxa" w:w="3008"/>
             <w:tcBorders>
               <w:top w:val="single" w:color="E2E6EA" w:sz="4"/>
               <w:left w:val="single" w:color="E2E6EA" w:sz="4"/>
@@ -4735,6 +5276,114 @@
         <w:gridCol w:w="2200"/>
         <w:gridCol w:w="6826"/>
       </w:tblGrid>
+      <w:tr>
+        <w:trPr>
+          <w:cantSplit/>
+        </w:trPr>
+        <w:tc>
+          <w:tcPr>
+            <w:tcW w:type="dxa" w:w="2200"/>
+            <w:tcMar>
+              <w:top w:type="dxa" w:w="90"/>
+              <w:left w:type="dxa" w:w="140"/>
+              <w:bottom w:type="dxa" w:w="90"/>
+              <w:right w:type="dxa" w:w="100"/>
+            </w:tcMar>
+          </w:tcPr>
+          <w:p>
+            <w:r>
+              <w:rPr>
+                <w:rFonts w:ascii="Calibri" w:cs="Calibri" w:eastAsia="Calibri" w:hAnsi="Calibri"/>
+                <w:b/>
+                <w:bCs/>
+                <w:color w:val="111827"/>
+                <w:sz w:val="21"/>
+                <w:szCs w:val="21"/>
+              </w:rPr>
+              <w:t xml:space="preserve">Cliente</w:t>
+            </w:r>
+          </w:p>
+        </w:tc>
+        <w:tc>
+          <w:tcPr>
+            <w:tcW w:type="dxa" w:w="6826"/>
+            <w:tcMar>
+              <w:top w:type="dxa" w:w="90"/>
+              <w:left w:type="dxa" w:w="100"/>
+              <w:bottom w:type="dxa" w:w="90"/>
+              <w:right w:type="dxa" w:w="140"/>
+            </w:tcMar>
+          </w:tcPr>
+          <w:p>
+            <w:pPr>
+              <w:spacing w:line="264"/>
+            </w:pPr>
+            <w:r>
+              <w:rPr>
+                <w:rFonts w:ascii="Calibri" w:cs="Calibri" w:eastAsia="Calibri" w:hAnsi="Calibri"/>
+                <w:color w:val="111827"/>
+                <w:sz w:val="21"/>
+                <w:szCs w:val="21"/>
+              </w:rPr>
+              <w:t xml:space="preserve">Un alumno de tercero adherido a su banco. Sólo a ellos les pueden dar tarjeta, préstamo, plazo fijo y atender por ventanilla.</w:t>
+            </w:r>
+          </w:p>
+        </w:tc>
+      </w:tr>
+      <w:tr>
+        <w:trPr>
+          <w:cantSplit/>
+        </w:trPr>
+        <w:tc>
+          <w:tcPr>
+            <w:tcW w:type="dxa" w:w="2200"/>
+            <w:tcMar>
+              <w:top w:type="dxa" w:w="90"/>
+              <w:left w:type="dxa" w:w="140"/>
+              <w:bottom w:type="dxa" w:w="90"/>
+              <w:right w:type="dxa" w:w="100"/>
+            </w:tcMar>
+          </w:tcPr>
+          <w:p>
+            <w:r>
+              <w:rPr>
+                <w:rFonts w:ascii="Calibri" w:cs="Calibri" w:eastAsia="Calibri" w:hAnsi="Calibri"/>
+                <w:b/>
+                <w:bCs/>
+                <w:color w:val="111827"/>
+                <w:sz w:val="21"/>
+                <w:szCs w:val="21"/>
+              </w:rPr>
+              <w:t xml:space="preserve">Banco principal</w:t>
+            </w:r>
+          </w:p>
+        </w:tc>
+        <w:tc>
+          <w:tcPr>
+            <w:tcW w:type="dxa" w:w="6826"/>
+            <w:tcMar>
+              <w:top w:type="dxa" w:w="90"/>
+              <w:left w:type="dxa" w:w="100"/>
+              <w:bottom w:type="dxa" w:w="90"/>
+              <w:right w:type="dxa" w:w="140"/>
+            </w:tcMar>
+          </w:tcPr>
+          <w:p>
+            <w:pPr>
+              <w:spacing w:line="264"/>
+            </w:pPr>
+            <w:r>
+              <w:rPr>
+                <w:rFonts w:ascii="Calibri" w:cs="Calibri" w:eastAsia="Calibri" w:hAnsi="Calibri"/>
+                <w:color w:val="111827"/>
+                <w:sz w:val="21"/>
+                <w:szCs w:val="21"/>
+              </w:rPr>
+              <w:t xml:space="preserve">El primer banco al que se adhirió un alumno. Puede ser cliente de varios, pero el principal es el primero.</w:t>
+            </w:r>
+          </w:p>
+        </w:tc>
+      </w:tr>
       <w:tr>
         <w:trPr>
           <w:cantSplit/>

</xml_diff>